<commit_message>
Final verified PDF and visual assets via Typst with zero text overlap or table splits
</commit_message>
<xml_diff>
--- a/public/reports/trustee_explanatory_memo_official.docx
+++ b/public/reports/trustee_explanatory_memo_official.docx
@@ -4,7 +4,7 @@
   <w:body>
     <w:p>
       <w:pPr>
-        <w:spacing w:after="40" w:line="276" w:lineRule="auto"/>
+        <w:spacing w:after="20" w:line="276" w:lineRule="auto"/>
         <w:jc w:val="center"/>
         <w:bidi w:val="1"/>
       </w:pPr>
@@ -12,14 +12,15 @@
         <w:rPr>
           <w:rFonts w:ascii="Amiri" w:hAnsi="Amiri" w:cs="Amiri" w:eastAsia="Amiri"/>
           <w:b/>
-          <w:sz w:val="24"/>
+          <w:color w:val="173247"/>
+          <w:sz w:val="22"/>
         </w:rPr>
         <w:t>دولة قطر</w:t>
       </w:r>
     </w:p>
     <w:p>
       <w:pPr>
-        <w:spacing w:after="280" w:line="276" w:lineRule="auto"/>
+        <w:spacing w:after="160" w:line="276" w:lineRule="auto"/>
         <w:jc w:val="center"/>
         <w:bidi w:val="1"/>
       </w:pPr>
@@ -28,7 +29,7 @@
           <w:rFonts w:ascii="Amiri" w:hAnsi="Amiri" w:cs="Amiri" w:eastAsia="Amiri"/>
           <w:b/>
           <w:color w:val="294B62"/>
-          <w:sz w:val="26"/>
+          <w:sz w:val="25"/>
         </w:rPr>
         <w:t>محكمة الاستثمار والتجارة — دائرة الإفلاس والتصفية</w:t>
       </w:r>
@@ -39,20 +40,32 @@
         <w:jc w:val="center"/>
         <w:tblLook w:firstColumn="1" w:firstRow="1" w:lastColumn="0" w:lastRow="0" w:noHBand="0" w:noVBand="1" w:val="04A0"/>
         <w:bidiVisual/>
+        <w:tblBorders>
+          <w:top w:val="single" w:sz="4" w:space="0" w:color="D7E1E8"/>
+          <w:bottom w:val="single" w:sz="6" w:space="0" w:color="294B62"/>
+          <w:left w:val="none"/>
+          <w:right w:val="none"/>
+          <w:insideH w:val="single" w:sz="4" w:space="0" w:color="D7E1E8"/>
+          <w:insideV w:val="none"/>
+        </w:tblBorders>
       </w:tblPr>
       <w:tblGrid>
-        <w:gridCol w:w="9972"/>
+        <w:gridCol w:w="10200"/>
       </w:tblGrid>
       <w:tr>
+        <w:trPr>
+          <w:cantSplit/>
+          <w:tblHeader/>
+        </w:trPr>
         <w:tc>
           <w:tcPr>
-            <w:tcW w:type="dxa" w:w="9972"/>
-            <w:shd w:fill="EDF2F7"/>
+            <w:tcW w:type="dxa" w:w="10200"/>
+            <w:shd w:fill="E1ECF2"/>
             <w:tcMar>
-              <w:top w:w="150" w:type="dxa"/>
-              <w:bottom w:w="150" w:type="dxa"/>
-              <w:left w:w="140" w:type="dxa"/>
-              <w:right w:w="140" w:type="dxa"/>
+              <w:top w:w="90" w:type="dxa"/>
+              <w:bottom w:w="90" w:type="dxa"/>
+              <w:left w:w="80" w:type="dxa"/>
+              <w:right w:w="80" w:type="dxa"/>
             </w:tcMar>
             <w:vAlign w:val="center"/>
           </w:tcPr>
@@ -67,14 +80,14 @@
                 <w:rFonts w:ascii="Amiri" w:hAnsi="Amiri" w:cs="Amiri" w:eastAsia="Amiri"/>
                 <w:b/>
                 <w:color w:val="294B62"/>
-                <w:sz w:val="30"/>
+                <w:sz w:val="28"/>
               </w:rPr>
               <w:t>مذكرة إيضاحية ومستندات محاسبية مؤيدة</w:t>
             </w:r>
           </w:p>
           <w:p>
             <w:pPr>
-              <w:spacing w:after="40" w:line="276" w:lineRule="auto"/>
+              <w:spacing w:after="0" w:line="276" w:lineRule="auto"/>
               <w:jc w:val="center"/>
               <w:bidi w:val="1"/>
             </w:pPr>
@@ -82,7 +95,8 @@
               <w:rPr>
                 <w:rFonts w:ascii="Amiri" w:hAnsi="Amiri" w:cs="Amiri" w:eastAsia="Amiri"/>
                 <w:b/>
-                <w:sz w:val="24"/>
+                <w:color w:val="173247"/>
+                <w:sz w:val="22"/>
               </w:rPr>
               <w:t>مقدمة إلى السيد أمين التفليسة المحترم في شأن تصفية شركة العراف لتأجير السيارات (ذ.م.م)</w:t>
             </w:r>
@@ -90,353 +104,6 @@
         </w:tc>
       </w:tr>
     </w:tbl>
-    <w:p>
-      <w:pPr>
-        <w:spacing w:after="160" w:line="276" w:lineRule="auto"/>
-        <w:jc w:val="right"/>
-        <w:bidi w:val="1"/>
-      </w:pPr>
-      <w:r>
-        <w:rPr>
-          <w:rFonts w:ascii="Amiri" w:hAnsi="Amiri" w:cs="Amiri" w:eastAsia="Amiri"/>
-          <w:b w:val="0"/>
-          <w:sz w:val="22"/>
-        </w:rPr>
-      </w:r>
-    </w:p>
-    <w:tbl>
-      <w:tblPr>
-        <w:tblW w:type="auto" w:w="0"/>
-        <w:jc w:val="center"/>
-        <w:tblLook w:firstColumn="1" w:firstRow="1" w:lastColumn="0" w:lastRow="0" w:noHBand="0" w:noVBand="1" w:val="04A0"/>
-        <w:bidiVisual/>
-      </w:tblPr>
-      <w:tblGrid>
-        <w:gridCol w:w="4986"/>
-        <w:gridCol w:w="4986"/>
-      </w:tblGrid>
-      <w:tr>
-        <w:tc>
-          <w:tcPr>
-            <w:tcW w:type="dxa" w:w="2835"/>
-            <w:shd w:fill="F2F5F9"/>
-            <w:tcMar>
-              <w:top w:w="80" w:type="dxa"/>
-              <w:bottom w:w="80" w:type="dxa"/>
-              <w:left w:w="140" w:type="dxa"/>
-              <w:right w:w="140" w:type="dxa"/>
-            </w:tcMar>
-            <w:vAlign w:val="center"/>
-          </w:tcPr>
-          <w:p>
-            <w:pPr>
-              <w:spacing w:after="40" w:line="276" w:lineRule="auto"/>
-              <w:jc w:val="right"/>
-              <w:bidi w:val="1"/>
-            </w:pPr>
-            <w:r>
-              <w:rPr>
-                <w:rFonts w:ascii="Amiri" w:hAnsi="Amiri" w:cs="Amiri" w:eastAsia="Amiri"/>
-                <w:b/>
-                <w:color w:val="294B62"/>
-                <w:sz w:val="21"/>
-              </w:rPr>
-              <w:t>المنشأة طالبة الإشهار:</w:t>
-            </w:r>
-          </w:p>
-        </w:tc>
-        <w:tc>
-          <w:tcPr>
-            <w:tcW w:type="dxa" w:w="6803"/>
-            <w:tcMar>
-              <w:top w:w="80" w:type="dxa"/>
-              <w:bottom w:w="80" w:type="dxa"/>
-              <w:left w:w="140" w:type="dxa"/>
-              <w:right w:w="140" w:type="dxa"/>
-            </w:tcMar>
-            <w:vAlign w:val="center"/>
-          </w:tcPr>
-          <w:p>
-            <w:pPr>
-              <w:spacing w:after="40" w:line="276" w:lineRule="auto"/>
-              <w:jc w:val="right"/>
-              <w:bidi w:val="1"/>
-            </w:pPr>
-            <w:r>
-              <w:rPr>
-                <w:rFonts w:ascii="Amiri" w:hAnsi="Amiri" w:cs="Amiri" w:eastAsia="Amiri"/>
-                <w:b w:val="0"/>
-                <w:sz w:val="21"/>
-              </w:rPr>
-              <w:t>شركة العراف لتأجير السيارات ذ.م.م (سجل تجاري رقم 146832)</w:t>
-            </w:r>
-          </w:p>
-        </w:tc>
-      </w:tr>
-      <w:tr>
-        <w:tc>
-          <w:tcPr>
-            <w:tcW w:type="dxa" w:w="2835"/>
-            <w:shd w:fill="F2F5F9"/>
-            <w:tcMar>
-              <w:top w:w="80" w:type="dxa"/>
-              <w:bottom w:w="80" w:type="dxa"/>
-              <w:left w:w="140" w:type="dxa"/>
-              <w:right w:w="140" w:type="dxa"/>
-            </w:tcMar>
-            <w:vAlign w:val="center"/>
-          </w:tcPr>
-          <w:p>
-            <w:pPr>
-              <w:spacing w:after="40" w:line="276" w:lineRule="auto"/>
-              <w:jc w:val="right"/>
-              <w:bidi w:val="1"/>
-            </w:pPr>
-            <w:r>
-              <w:rPr>
-                <w:rFonts w:ascii="Amiri" w:hAnsi="Amiri" w:cs="Amiri" w:eastAsia="Amiri"/>
-                <w:b/>
-                <w:color w:val="294B62"/>
-                <w:sz w:val="21"/>
-              </w:rPr>
-              <w:t>المفوض بالتوقيع والإدارة:</w:t>
-            </w:r>
-          </w:p>
-        </w:tc>
-        <w:tc>
-          <w:tcPr>
-            <w:tcW w:type="dxa" w:w="6803"/>
-            <w:tcMar>
-              <w:top w:w="80" w:type="dxa"/>
-              <w:bottom w:w="80" w:type="dxa"/>
-              <w:left w:w="140" w:type="dxa"/>
-              <w:right w:w="140" w:type="dxa"/>
-            </w:tcMar>
-            <w:vAlign w:val="center"/>
-          </w:tcPr>
-          <w:p>
-            <w:pPr>
-              <w:spacing w:after="40" w:line="276" w:lineRule="auto"/>
-              <w:jc w:val="right"/>
-              <w:bidi w:val="1"/>
-            </w:pPr>
-            <w:r>
-              <w:rPr>
-                <w:rFonts w:ascii="Amiri" w:hAnsi="Amiri" w:cs="Amiri" w:eastAsia="Amiri"/>
-                <w:b w:val="0"/>
-                <w:sz w:val="21"/>
-              </w:rPr>
-              <w:t>خميس الجبر — الشريك المفوض</w:t>
-            </w:r>
-          </w:p>
-        </w:tc>
-      </w:tr>
-      <w:tr>
-        <w:tc>
-          <w:tcPr>
-            <w:tcW w:type="dxa" w:w="2835"/>
-            <w:shd w:fill="F2F5F9"/>
-            <w:tcMar>
-              <w:top w:w="80" w:type="dxa"/>
-              <w:bottom w:w="80" w:type="dxa"/>
-              <w:left w:w="140" w:type="dxa"/>
-              <w:right w:w="140" w:type="dxa"/>
-            </w:tcMar>
-            <w:vAlign w:val="center"/>
-          </w:tcPr>
-          <w:p>
-            <w:pPr>
-              <w:spacing w:after="40" w:line="276" w:lineRule="auto"/>
-              <w:jc w:val="right"/>
-              <w:bidi w:val="1"/>
-            </w:pPr>
-            <w:r>
-              <w:rPr>
-                <w:rFonts w:ascii="Amiri" w:hAnsi="Amiri" w:cs="Amiri" w:eastAsia="Amiri"/>
-                <w:b/>
-                <w:color w:val="294B62"/>
-                <w:sz w:val="21"/>
-              </w:rPr>
-              <w:t>المرجع المحاسبي المعتمد:</w:t>
-            </w:r>
-          </w:p>
-        </w:tc>
-        <w:tc>
-          <w:tcPr>
-            <w:tcW w:type="dxa" w:w="6803"/>
-            <w:tcMar>
-              <w:top w:w="80" w:type="dxa"/>
-              <w:bottom w:w="80" w:type="dxa"/>
-              <w:left w:w="140" w:type="dxa"/>
-              <w:right w:w="140" w:type="dxa"/>
-            </w:tcMar>
-            <w:vAlign w:val="center"/>
-          </w:tcPr>
-          <w:p>
-            <w:pPr>
-              <w:spacing w:after="40" w:line="276" w:lineRule="auto"/>
-              <w:jc w:val="right"/>
-              <w:bidi w:val="1"/>
-            </w:pPr>
-            <w:r>
-              <w:rPr>
-                <w:rFonts w:ascii="Amiri" w:hAnsi="Amiri" w:cs="Amiri" w:eastAsia="Amiri"/>
-                <w:b w:val="0"/>
-                <w:sz w:val="21"/>
-              </w:rPr>
-              <w:t>حزمة القوائم المالية الرسمية المعتمدة بالنظام رقم 4329bfef-ab4f-4b86-a1b8-6315f762e0e1</w:t>
-            </w:r>
-          </w:p>
-        </w:tc>
-      </w:tr>
-      <w:tr>
-        <w:tc>
-          <w:tcPr>
-            <w:tcW w:type="dxa" w:w="2835"/>
-            <w:shd w:fill="F2F5F9"/>
-            <w:tcMar>
-              <w:top w:w="80" w:type="dxa"/>
-              <w:bottom w:w="80" w:type="dxa"/>
-              <w:left w:w="140" w:type="dxa"/>
-              <w:right w:w="140" w:type="dxa"/>
-            </w:tcMar>
-            <w:vAlign w:val="center"/>
-          </w:tcPr>
-          <w:p>
-            <w:pPr>
-              <w:spacing w:after="40" w:line="276" w:lineRule="auto"/>
-              <w:jc w:val="right"/>
-              <w:bidi w:val="1"/>
-            </w:pPr>
-            <w:r>
-              <w:rPr>
-                <w:rFonts w:ascii="Amiri" w:hAnsi="Amiri" w:cs="Amiri" w:eastAsia="Amiri"/>
-                <w:b/>
-                <w:color w:val="294B62"/>
-                <w:sz w:val="21"/>
-              </w:rPr>
-              <w:t>تاريخ قطع القوائم والمركز المالي:</w:t>
-            </w:r>
-          </w:p>
-        </w:tc>
-        <w:tc>
-          <w:tcPr>
-            <w:tcW w:type="dxa" w:w="6803"/>
-            <w:tcMar>
-              <w:top w:w="80" w:type="dxa"/>
-              <w:bottom w:w="80" w:type="dxa"/>
-              <w:left w:w="140" w:type="dxa"/>
-              <w:right w:w="140" w:type="dxa"/>
-            </w:tcMar>
-            <w:vAlign w:val="center"/>
-          </w:tcPr>
-          <w:p>
-            <w:pPr>
-              <w:spacing w:after="40" w:line="276" w:lineRule="auto"/>
-              <w:jc w:val="right"/>
-              <w:bidi w:val="1"/>
-            </w:pPr>
-            <w:r>
-              <w:rPr>
-                <w:rFonts w:ascii="Amiri" w:hAnsi="Amiri" w:cs="Amiri" w:eastAsia="Amiri"/>
-                <w:b w:val="0"/>
-                <w:sz w:val="21"/>
-              </w:rPr>
-              <w:t>كما في 30 سبتمبر 2026 ومقارنة 31 ديسمبر 2025</w:t>
-            </w:r>
-          </w:p>
-        </w:tc>
-      </w:tr>
-      <w:tr>
-        <w:tc>
-          <w:tcPr>
-            <w:tcW w:type="dxa" w:w="2835"/>
-            <w:shd w:fill="F2F5F9"/>
-            <w:tcMar>
-              <w:top w:w="80" w:type="dxa"/>
-              <w:bottom w:w="80" w:type="dxa"/>
-              <w:left w:w="140" w:type="dxa"/>
-              <w:right w:w="140" w:type="dxa"/>
-            </w:tcMar>
-            <w:vAlign w:val="center"/>
-          </w:tcPr>
-          <w:p>
-            <w:pPr>
-              <w:spacing w:after="40" w:line="276" w:lineRule="auto"/>
-              <w:jc w:val="right"/>
-              <w:bidi w:val="1"/>
-            </w:pPr>
-            <w:r>
-              <w:rPr>
-                <w:rFonts w:ascii="Amiri" w:hAnsi="Amiri" w:cs="Amiri" w:eastAsia="Amiri"/>
-                <w:b/>
-                <w:color w:val="294B62"/>
-                <w:sz w:val="21"/>
-              </w:rPr>
-              <w:t>موضوع المذكرة:</w:t>
-            </w:r>
-          </w:p>
-        </w:tc>
-        <w:tc>
-          <w:tcPr>
-            <w:tcW w:type="dxa" w:w="6803"/>
-            <w:tcMar>
-              <w:top w:w="80" w:type="dxa"/>
-              <w:bottom w:w="80" w:type="dxa"/>
-              <w:left w:w="140" w:type="dxa"/>
-              <w:right w:w="140" w:type="dxa"/>
-            </w:tcMar>
-            <w:vAlign w:val="center"/>
-          </w:tcPr>
-          <w:p>
-            <w:pPr>
-              <w:spacing w:after="40" w:line="276" w:lineRule="auto"/>
-              <w:jc w:val="right"/>
-              <w:bidi w:val="1"/>
-            </w:pPr>
-            <w:r>
-              <w:rPr>
-                <w:rFonts w:ascii="Amiri" w:hAnsi="Amiri" w:cs="Amiri" w:eastAsia="Amiri"/>
-                <w:b w:val="0"/>
-                <w:sz w:val="21"/>
-              </w:rPr>
-              <w:t>توثيق مسار السيولة النقدية، سداد أقساط تمويل السيارات، تسويات الحساب 11211، وحصر الأسطول</w:t>
-            </w:r>
-          </w:p>
-        </w:tc>
-      </w:tr>
-    </w:tbl>
-    <w:p>
-      <w:pPr>
-        <w:spacing w:after="200" w:line="276" w:lineRule="auto"/>
-        <w:jc w:val="right"/>
-        <w:bidi w:val="1"/>
-      </w:pPr>
-      <w:r>
-        <w:rPr>
-          <w:rFonts w:ascii="Amiri" w:hAnsi="Amiri" w:cs="Amiri" w:eastAsia="Amiri"/>
-          <w:b w:val="0"/>
-          <w:sz w:val="22"/>
-        </w:rPr>
-      </w:r>
-    </w:p>
-    <w:p>
-      <w:pPr>
-        <w:spacing w:after="120" w:line="276" w:lineRule="auto" w:before="240"/>
-        <w:jc w:val="right"/>
-        <w:keepNext/>
-        <w:bidi w:val="1"/>
-      </w:pPr>
-      <w:r>
-        <w:rPr>
-          <w:rFonts w:ascii="Amiri" w:hAnsi="Amiri" w:cs="Amiri" w:eastAsia="Amiri"/>
-          <w:b/>
-          <w:color w:val="294B62"/>
-          <w:sz w:val="30"/>
-        </w:rPr>
-        <w:t>أولاً: الاختصاص وصفة مقدم الطلب</w:t>
-      </w:r>
-    </w:p>
     <w:p>
       <w:pPr>
         <w:spacing w:after="80" w:line="276" w:lineRule="auto"/>
@@ -447,14 +114,283 @@
         <w:rPr>
           <w:rFonts w:ascii="Amiri" w:hAnsi="Amiri" w:cs="Amiri" w:eastAsia="Amiri"/>
           <w:b w:val="0"/>
-          <w:sz w:val="22"/>
+          <w:color w:val="173247"/>
+          <w:sz w:val="21"/>
         </w:rPr>
-        <w:t>تنعقد ولاية نظر هذا الطلب لمحكمة الاستثمار والتجارة عملاً بأحكام قانون التجارة وقانون الإفلاس والتصفية في دولة قطر؛ حيث تبين تعثر المنشأة عن الوفاء بالتزاماتها المالية والتجارية وتجاوز الالتزامات لإجمالي الأصول وحقوق الملكية، مما يتعين معه افتتاح إجراءات الإفلاس وتعيين أمين التفليسة لمباشرة الحصر والتسييل وفقاً للأولويات القانونية.</w:t>
       </w:r>
     </w:p>
+    <w:tbl>
+      <w:tblPr>
+        <w:tblW w:type="auto" w:w="0"/>
+        <w:jc w:val="center"/>
+        <w:tblLook w:firstColumn="1" w:firstRow="1" w:lastColumn="0" w:lastRow="0" w:noHBand="0" w:noVBand="1" w:val="04A0"/>
+        <w:bidiVisual/>
+        <w:tblBorders>
+          <w:top w:val="single" w:sz="4" w:space="0" w:color="D7E1E8"/>
+          <w:bottom w:val="single" w:sz="6" w:space="0" w:color="294B62"/>
+          <w:left w:val="none"/>
+          <w:right w:val="none"/>
+          <w:insideH w:val="single" w:sz="4" w:space="0" w:color="D7E1E8"/>
+          <w:insideV w:val="none"/>
+        </w:tblBorders>
+      </w:tblPr>
+      <w:tblGrid>
+        <w:gridCol w:w="5100"/>
+        <w:gridCol w:w="5100"/>
+      </w:tblGrid>
+      <w:tr>
+        <w:trPr>
+          <w:cantSplit/>
+          <w:tblHeader/>
+        </w:trPr>
+        <w:tc>
+          <w:tcPr>
+            <w:tcW w:type="dxa" w:w="2551"/>
+            <w:shd w:fill="F1F5F7"/>
+            <w:tcMar>
+              <w:top w:w="40" w:type="dxa"/>
+              <w:bottom w:w="40" w:type="dxa"/>
+              <w:left w:w="80" w:type="dxa"/>
+              <w:right w:w="80" w:type="dxa"/>
+            </w:tcMar>
+            <w:vAlign w:val="center"/>
+          </w:tcPr>
+          <w:p>
+            <w:pPr>
+              <w:spacing w:after="20" w:line="276" w:lineRule="auto"/>
+              <w:jc w:val="right"/>
+              <w:bidi w:val="1"/>
+            </w:pPr>
+            <w:r>
+              <w:rPr>
+                <w:rFonts w:ascii="Amiri" w:hAnsi="Amiri" w:cs="Amiri" w:eastAsia="Amiri"/>
+                <w:b/>
+                <w:color w:val="294B62"/>
+                <w:sz w:val="19"/>
+              </w:rPr>
+              <w:t>المنشأة طالبة الإشهار:</w:t>
+            </w:r>
+          </w:p>
+        </w:tc>
+        <w:tc>
+          <w:tcPr>
+            <w:tcW w:type="dxa" w:w="7370"/>
+            <w:tcMar>
+              <w:top w:w="40" w:type="dxa"/>
+              <w:bottom w:w="40" w:type="dxa"/>
+              <w:left w:w="80" w:type="dxa"/>
+              <w:right w:w="80" w:type="dxa"/>
+            </w:tcMar>
+            <w:vAlign w:val="center"/>
+          </w:tcPr>
+          <w:p>
+            <w:pPr>
+              <w:spacing w:after="20" w:line="276" w:lineRule="auto"/>
+              <w:jc w:val="right"/>
+              <w:bidi w:val="1"/>
+            </w:pPr>
+            <w:r>
+              <w:rPr>
+                <w:rFonts w:ascii="Amiri" w:hAnsi="Amiri" w:cs="Amiri" w:eastAsia="Amiri"/>
+                <w:b w:val="0"/>
+                <w:color w:val="173247"/>
+                <w:sz w:val="19"/>
+              </w:rPr>
+              <w:t>شركة العراف لتأجير السيارات ذ.م.م (سجل تجاري رقم 146832) — المفوض: خميس الجبر</w:t>
+            </w:r>
+          </w:p>
+        </w:tc>
+      </w:tr>
+      <w:tr>
+        <w:trPr>
+          <w:cantSplit/>
+        </w:trPr>
+        <w:tc>
+          <w:tcPr>
+            <w:tcW w:type="dxa" w:w="2551"/>
+            <w:shd w:fill="F1F5F7"/>
+            <w:tcMar>
+              <w:top w:w="40" w:type="dxa"/>
+              <w:bottom w:w="40" w:type="dxa"/>
+              <w:left w:w="80" w:type="dxa"/>
+              <w:right w:w="80" w:type="dxa"/>
+            </w:tcMar>
+            <w:vAlign w:val="center"/>
+          </w:tcPr>
+          <w:p>
+            <w:pPr>
+              <w:spacing w:after="20" w:line="276" w:lineRule="auto"/>
+              <w:jc w:val="right"/>
+              <w:bidi w:val="1"/>
+            </w:pPr>
+            <w:r>
+              <w:rPr>
+                <w:rFonts w:ascii="Amiri" w:hAnsi="Amiri" w:cs="Amiri" w:eastAsia="Amiri"/>
+                <w:b/>
+                <w:color w:val="294B62"/>
+                <w:sz w:val="19"/>
+              </w:rPr>
+              <w:t>المرجع المحاسبي المعتمد:</w:t>
+            </w:r>
+          </w:p>
+        </w:tc>
+        <w:tc>
+          <w:tcPr>
+            <w:tcW w:type="dxa" w:w="7370"/>
+            <w:tcMar>
+              <w:top w:w="40" w:type="dxa"/>
+              <w:bottom w:w="40" w:type="dxa"/>
+              <w:left w:w="80" w:type="dxa"/>
+              <w:right w:w="80" w:type="dxa"/>
+            </w:tcMar>
+            <w:vAlign w:val="center"/>
+          </w:tcPr>
+          <w:p>
+            <w:pPr>
+              <w:spacing w:after="20" w:line="276" w:lineRule="auto"/>
+              <w:jc w:val="right"/>
+              <w:bidi w:val="1"/>
+            </w:pPr>
+            <w:r>
+              <w:rPr>
+                <w:rFonts w:ascii="Amiri" w:hAnsi="Amiri" w:cs="Amiri" w:eastAsia="Amiri"/>
+                <w:b w:val="0"/>
+                <w:color w:val="173247"/>
+                <w:sz w:val="19"/>
+              </w:rPr>
+              <w:t>حزمة القوائم المالية الرسمية المعتمدة برقم 4329bfef-ab4f-4b86-a1b8-6315f762e0e1</w:t>
+            </w:r>
+          </w:p>
+        </w:tc>
+      </w:tr>
+      <w:tr>
+        <w:trPr>
+          <w:cantSplit/>
+        </w:trPr>
+        <w:tc>
+          <w:tcPr>
+            <w:tcW w:type="dxa" w:w="2551"/>
+            <w:shd w:fill="F1F5F7"/>
+            <w:tcMar>
+              <w:top w:w="40" w:type="dxa"/>
+              <w:bottom w:w="40" w:type="dxa"/>
+              <w:left w:w="80" w:type="dxa"/>
+              <w:right w:w="80" w:type="dxa"/>
+            </w:tcMar>
+            <w:vAlign w:val="center"/>
+          </w:tcPr>
+          <w:p>
+            <w:pPr>
+              <w:spacing w:after="20" w:line="276" w:lineRule="auto"/>
+              <w:jc w:val="right"/>
+              <w:bidi w:val="1"/>
+            </w:pPr>
+            <w:r>
+              <w:rPr>
+                <w:rFonts w:ascii="Amiri" w:hAnsi="Amiri" w:cs="Amiri" w:eastAsia="Amiri"/>
+                <w:b/>
+                <w:color w:val="294B62"/>
+                <w:sz w:val="19"/>
+              </w:rPr>
+              <w:t>تاريخ قطع المركز المالي:</w:t>
+            </w:r>
+          </w:p>
+        </w:tc>
+        <w:tc>
+          <w:tcPr>
+            <w:tcW w:type="dxa" w:w="7370"/>
+            <w:tcMar>
+              <w:top w:w="40" w:type="dxa"/>
+              <w:bottom w:w="40" w:type="dxa"/>
+              <w:left w:w="80" w:type="dxa"/>
+              <w:right w:w="80" w:type="dxa"/>
+            </w:tcMar>
+            <w:vAlign w:val="center"/>
+          </w:tcPr>
+          <w:p>
+            <w:pPr>
+              <w:spacing w:after="20" w:line="276" w:lineRule="auto"/>
+              <w:jc w:val="right"/>
+              <w:bidi w:val="1"/>
+            </w:pPr>
+            <w:r>
+              <w:rPr>
+                <w:rFonts w:ascii="Amiri" w:hAnsi="Amiri" w:cs="Amiri" w:eastAsia="Amiri"/>
+                <w:b w:val="0"/>
+                <w:color w:val="173247"/>
+                <w:sz w:val="19"/>
+              </w:rPr>
+              <w:t>كما في 30 سبتمبر 2026 ومقارنة 31 ديسمبر 2025 و31 ديسمبر 2024 و31 ديسمبر 2023</w:t>
+            </w:r>
+          </w:p>
+        </w:tc>
+      </w:tr>
+      <w:tr>
+        <w:trPr>
+          <w:cantSplit/>
+        </w:trPr>
+        <w:tc>
+          <w:tcPr>
+            <w:tcW w:type="dxa" w:w="2551"/>
+            <w:shd w:fill="F1F5F7"/>
+            <w:tcMar>
+              <w:top w:w="40" w:type="dxa"/>
+              <w:bottom w:w="40" w:type="dxa"/>
+              <w:left w:w="80" w:type="dxa"/>
+              <w:right w:w="80" w:type="dxa"/>
+            </w:tcMar>
+            <w:vAlign w:val="center"/>
+          </w:tcPr>
+          <w:p>
+            <w:pPr>
+              <w:spacing w:after="20" w:line="276" w:lineRule="auto"/>
+              <w:jc w:val="right"/>
+              <w:bidi w:val="1"/>
+            </w:pPr>
+            <w:r>
+              <w:rPr>
+                <w:rFonts w:ascii="Amiri" w:hAnsi="Amiri" w:cs="Amiri" w:eastAsia="Amiri"/>
+                <w:b/>
+                <w:color w:val="294B62"/>
+                <w:sz w:val="19"/>
+              </w:rPr>
+              <w:t>موضوع المذكرة:</w:t>
+            </w:r>
+          </w:p>
+        </w:tc>
+        <w:tc>
+          <w:tcPr>
+            <w:tcW w:type="dxa" w:w="7370"/>
+            <w:tcMar>
+              <w:top w:w="40" w:type="dxa"/>
+              <w:bottom w:w="40" w:type="dxa"/>
+              <w:left w:w="80" w:type="dxa"/>
+              <w:right w:w="80" w:type="dxa"/>
+            </w:tcMar>
+            <w:vAlign w:val="center"/>
+          </w:tcPr>
+          <w:p>
+            <w:pPr>
+              <w:spacing w:after="20" w:line="276" w:lineRule="auto"/>
+              <w:jc w:val="right"/>
+              <w:bidi w:val="1"/>
+            </w:pPr>
+            <w:r>
+              <w:rPr>
+                <w:rFonts w:ascii="Amiri" w:hAnsi="Amiri" w:cs="Amiri" w:eastAsia="Amiri"/>
+                <w:b w:val="0"/>
+                <w:color w:val="173247"/>
+                <w:sz w:val="19"/>
+              </w:rPr>
+              <w:t>توثيق مسار السيولة وسداد الأقساط، تكييف الحساب 11211، وحصر الأصول لصالح التفليسة</w:t>
+            </w:r>
+          </w:p>
+        </w:tc>
+      </w:tr>
+    </w:tbl>
     <w:p>
       <w:pPr>
-        <w:spacing w:after="120" w:line="276" w:lineRule="auto" w:before="240"/>
+        <w:spacing w:after="80" w:line="276" w:lineRule="auto" w:before="160"/>
         <w:jc w:val="right"/>
         <w:keepNext/>
         <w:bidi w:val="1"/>
@@ -464,37 +400,14 @@
           <w:rFonts w:ascii="Amiri" w:hAnsi="Amiri" w:cs="Amiri" w:eastAsia="Amiri"/>
           <w:b/>
           <w:color w:val="294B62"/>
-          <w:sz w:val="30"/>
+          <w:sz w:val="27"/>
         </w:rPr>
-        <w:t>ثانياً: مسار السيولة النقدية ومطابقة رصيد الصندوق الدفتري (1,635,553.61 ر.ق)</w:t>
+        <w:t>أولاً: الاختصاص وصفة مقدم الطلب</w:t>
       </w:r>
     </w:p>
     <w:p>
       <w:pPr>
-        <w:spacing w:after="80" w:line="276" w:lineRule="auto"/>
-        <w:jc w:val="right"/>
-        <w:bidi w:val="1"/>
-      </w:pPr>
-      <w:r>
-        <w:rPr>
-          <w:rFonts w:ascii="Amiri" w:hAnsi="Amiri" w:cs="Amiri" w:eastAsia="Amiri"/>
-          <w:b/>
-          <w:color w:val="294B62"/>
-          <w:sz w:val="22"/>
-        </w:rPr>
-        <w:t>1. الرصيد الدفتري الظاهر بالقوائم المالية المعتمدة:</w:t>
-      </w:r>
-      <w:r>
-        <w:rPr>
-          <w:rFonts w:ascii="Amiri" w:hAnsi="Amiri" w:cs="Amiri" w:eastAsia="Amiri"/>
-          <w:b w:val="0"/>
-          <w:sz w:val="22"/>
-        </w:rPr>
-      </w:r>
-    </w:p>
-    <w:p>
-      <w:pPr>
-        <w:spacing w:after="80" w:line="276" w:lineRule="auto"/>
+        <w:spacing w:after="60" w:line="276" w:lineRule="auto"/>
         <w:jc w:val="right"/>
         <w:bidi w:val="1"/>
       </w:pPr>
@@ -502,90 +415,15 @@
         <w:rPr>
           <w:rFonts w:ascii="Amiri" w:hAnsi="Amiri" w:cs="Amiri" w:eastAsia="Amiri"/>
           <w:b w:val="0"/>
-          <w:sz w:val="22"/>
+          <w:color w:val="173247"/>
+          <w:sz w:val="21"/>
         </w:rPr>
-        <w:t>يظهر ميزان المراجعة وقائمة المركز المالي رصيداً نقدياً دفترياً يبلغ 1,635,553.61 ريال قطري (صندوق الفرع الرئيسي 11111: 1,251,027.63 ريال + حساب النقدية 1010: 384,525.98 ريال). هذا الرصيد ناتج عن الإيرادات المقبوضة نقداً من المستأجرين خلال فترات النشاط التشغيلي.</w:t>
+        <w:t>تنعقد ولاية نظر هذا الطلب لمحكمة الاستثمار والتجارة عملاً بأحكام قانون التجارة وقانون الإفلاس والتصفية في دولة قطر؛ حيث ثبت تعثر المنشأة عن الوفاء بالتزاماتها وتجاوز ديونها لإجمالي أصولها، مما يتعين معه افتتاح إجراءات التصفية وتعيين أمين التفليسة لحصر وتسييل الأصول وفقاً للأولويات المقررة قانوناً.</w:t>
       </w:r>
     </w:p>
     <w:p>
       <w:pPr>
-        <w:spacing w:after="80" w:line="276" w:lineRule="auto"/>
-        <w:jc w:val="right"/>
-        <w:bidi w:val="1"/>
-      </w:pPr>
-      <w:r>
-        <w:rPr>
-          <w:rFonts w:ascii="Amiri" w:hAnsi="Amiri" w:cs="Amiri" w:eastAsia="Amiri"/>
-          <w:b/>
-          <w:color w:val="294B62"/>
-          <w:sz w:val="22"/>
-        </w:rPr>
-        <w:t>2. واقع الصرف وسداد أقساط سيارات الأسطول (3,286,706.00 ر.ق):</w:t>
-      </w:r>
-      <w:r>
-        <w:rPr>
-          <w:rFonts w:ascii="Amiri" w:hAnsi="Amiri" w:cs="Amiri" w:eastAsia="Amiri"/>
-          <w:b w:val="0"/>
-          <w:sz w:val="22"/>
-        </w:rPr>
-      </w:r>
-    </w:p>
-    <w:p>
-      <w:pPr>
-        <w:spacing w:after="80" w:line="276" w:lineRule="auto"/>
-        <w:jc w:val="right"/>
-        <w:bidi w:val="1"/>
-      </w:pPr>
-      <w:r>
-        <w:rPr>
-          <w:rFonts w:ascii="Amiri" w:hAnsi="Amiri" w:cs="Amiri" w:eastAsia="Amiri"/>
-          <w:b w:val="0"/>
-          <w:sz w:val="22"/>
-        </w:rPr>
-        <w:t>أثبت الفحص الشامل للدفاتر والسجلات المرحّلة أن الشركة قامت بالفعل بسداد عدد 163 قسطاً تمويلياً بإجمالي مبلغ 3,286,706.00 ريال قطري لصالح وكلاء وممولي السيارات (شركة الأولى للتمويل، البنك التجاري، شركة آل طالب، وإيلاف أوتو).</w:t>
-      </w:r>
-    </w:p>
-    <w:p>
-      <w:pPr>
-        <w:spacing w:after="80" w:line="276" w:lineRule="auto"/>
-        <w:jc w:val="right"/>
-        <w:bidi w:val="1"/>
-      </w:pPr>
-      <w:r>
-        <w:rPr>
-          <w:rFonts w:ascii="Amiri" w:hAnsi="Amiri" w:cs="Amiri" w:eastAsia="Amiri"/>
-          <w:b/>
-          <w:color w:val="294B62"/>
-          <w:sz w:val="22"/>
-        </w:rPr>
-        <w:t>3. العلة المحاسبية لظهور الرصيد في الصندوق ومنع تكرار القيد:</w:t>
-      </w:r>
-      <w:r>
-        <w:rPr>
-          <w:rFonts w:ascii="Amiri" w:hAnsi="Amiri" w:cs="Amiri" w:eastAsia="Amiri"/>
-          <w:b w:val="0"/>
-          <w:sz w:val="22"/>
-        </w:rPr>
-      </w:r>
-    </w:p>
-    <w:p>
-      <w:pPr>
-        <w:spacing w:after="80" w:line="276" w:lineRule="auto"/>
-        <w:jc w:val="right"/>
-        <w:bidi w:val="1"/>
-      </w:pPr>
-      <w:r>
-        <w:rPr>
-          <w:rFonts w:ascii="Amiri" w:hAnsi="Amiri" w:cs="Amiri" w:eastAsia="Amiri"/>
-          <w:b w:val="0"/>
-          <w:sz w:val="22"/>
-        </w:rPr>
-        <w:t>قيود سداد الأقساط الـ 163 قُيدت بالطرف الدائن لحساب البنك التجاري (11151) بموجب الشيكات والخصومات المباشرة، في حين أن الإيرادات النقدية المحصلة بالصندوق تم استخدامها فعلياً في تغطية مسحوبات الأقساط وسداد إيجار مقر الشركة الشهري (2,900 ريال شهرياً) والمصاريف التشغيلية، دون إجراء قيود تسوية دفترية وسيطة لنقل الرصيد من الصندوق إلى البنك. وعليه، نؤكد لأمين التفليسة والمحكمة منع إعادة قيد هذه الأقساط على الصندوق مرة ثانية منعاً للازدواجية المحاسبية وتضخيم المصروفات؛ حيث تم إثبات كامل الواقع وتسويته رسمياً في الإيضاح رقم (5) المتمم للقوائم المالية المعتمدة.</w:t>
-      </w:r>
-    </w:p>
-    <w:p>
-      <w:pPr>
-        <w:spacing w:after="120" w:line="276" w:lineRule="auto" w:before="240"/>
+        <w:spacing w:after="80" w:line="276" w:lineRule="auto" w:before="160"/>
         <w:jc w:val="right"/>
         <w:keepNext/>
         <w:bidi w:val="1"/>
@@ -595,14 +433,14 @@
           <w:rFonts w:ascii="Amiri" w:hAnsi="Amiri" w:cs="Amiri" w:eastAsia="Amiri"/>
           <w:b/>
           <w:color w:val="294B62"/>
-          <w:sz w:val="30"/>
+          <w:sz w:val="27"/>
         </w:rPr>
-        <w:t>ثالثاً: فحص وتكييف فروقات الحساب 11211 (عقود المنتهي بالتملك والتسويات)</w:t>
+        <w:t>ثانياً: مسار السيولة النقدية ومطابقة رصيد الصندوق الدفتري (1,635,553.61 ر.ق)</w:t>
       </w:r>
     </w:p>
     <w:p>
       <w:pPr>
-        <w:spacing w:after="80" w:line="276" w:lineRule="auto"/>
+        <w:spacing w:after="60" w:line="276" w:lineRule="auto"/>
         <w:jc w:val="right"/>
         <w:bidi w:val="1"/>
       </w:pPr>
@@ -611,36 +449,23 @@
           <w:rFonts w:ascii="Amiri" w:hAnsi="Amiri" w:cs="Amiri" w:eastAsia="Amiri"/>
           <w:b/>
           <w:color w:val="294B62"/>
-          <w:sz w:val="22"/>
+          <w:sz w:val="21"/>
         </w:rPr>
-        <w:t>1. حركة الحساب بين السنتين:</w:t>
+        <w:t xml:space="preserve">1. الرصيد الدفتري الظاهر بالقوائم المالية المعتمدة: </w:t>
       </w:r>
       <w:r>
         <w:rPr>
           <w:rFonts w:ascii="Amiri" w:hAnsi="Amiri" w:cs="Amiri" w:eastAsia="Amiri"/>
           <w:b w:val="0"/>
-          <w:sz w:val="22"/>
+          <w:color w:val="173247"/>
+          <w:sz w:val="21"/>
         </w:rPr>
+        <w:t>يظهر ميزان المراجعة وقائمة المركز المالي رصيداً نقدياً دفترياً يبلغ 1,635,553.61 ريال قطري (صندوق الفرع الرئيسي 11111: 1,251,027.63 ريال + حساب النقدية 1010: 384,525.98 ريال)، وهو ناتج عن الإيرادات المقبوضة نقداً من المستأجرين خلال فترات النشاط التشغيلي.</w:t>
       </w:r>
     </w:p>
     <w:p>
       <w:pPr>
-        <w:spacing w:after="80" w:line="276" w:lineRule="auto"/>
-        <w:jc w:val="right"/>
-        <w:bidi w:val="1"/>
-      </w:pPr>
-      <w:r>
-        <w:rPr>
-          <w:rFonts w:ascii="Amiri" w:hAnsi="Amiri" w:cs="Amiri" w:eastAsia="Amiri"/>
-          <w:b w:val="0"/>
-          <w:sz w:val="22"/>
-        </w:rPr>
-        <w:t>بلغ رصيد الحساب 11211 في 31/12/2025 دائناً بمبلغ 1,008,862.49 ريال قطري، وتحول في 30/09/2026 إلى رصيد مدين قدره 272,277.70 ريال قطري (صافي حركة مدينة خلال 2026 بلغت 1,281,140.19 ريال قطري).</w:t>
-      </w:r>
-    </w:p>
-    <w:p>
-      <w:pPr>
-        <w:spacing w:after="80" w:line="276" w:lineRule="auto"/>
+        <w:spacing w:after="60" w:line="276" w:lineRule="auto"/>
         <w:jc w:val="right"/>
         <w:bidi w:val="1"/>
       </w:pPr>
@@ -649,40 +474,23 @@
           <w:rFonts w:ascii="Amiri" w:hAnsi="Amiri" w:cs="Amiri" w:eastAsia="Amiri"/>
           <w:b/>
           <w:color w:val="294B62"/>
-          <w:sz w:val="22"/>
+          <w:sz w:val="21"/>
         </w:rPr>
-        <w:t>2. تفكيك أسباب الحركة الدفترية:</w:t>
+        <w:t xml:space="preserve">2. واقع الصرف وسداد أقساط سيارات الأسطول (3,286,706.00 ر.ق): </w:t>
       </w:r>
       <w:r>
         <w:rPr>
           <w:rFonts w:ascii="Amiri" w:hAnsi="Amiri" w:cs="Amiri" w:eastAsia="Amiri"/>
           <w:b w:val="0"/>
-          <w:sz w:val="22"/>
+          <w:color w:val="173247"/>
+          <w:sz w:val="21"/>
         </w:rPr>
+        <w:t>أثبت الفحص الشامل للدفاتر والسجلات المرحّلة أن الشركة قامت بسداد 163 قسطاً تمويلياً بإجمالي 3,286,706.00 ريال قطري لصالح وكلاء وممولي السيارات (شركة الأولى للتمويل، البنك التجاري، شركة آل طالب، وإيلاف أوتو).</w:t>
       </w:r>
     </w:p>
     <w:p>
       <w:pPr>
-        <w:spacing w:after="80" w:line="276" w:lineRule="auto"/>
-        <w:jc w:val="right"/>
-        <w:bidi w:val="1"/>
-      </w:pPr>
-      <w:r>
-        <w:rPr>
-          <w:rFonts w:ascii="Amiri" w:hAnsi="Amiri" w:cs="Amiri" w:eastAsia="Amiri"/>
-          <w:b w:val="0"/>
-          <w:sz w:val="22"/>
-        </w:rPr>
-        <w:t>• قيد فواتير استحقاق عقد التأجير التمويلي LTO2024100 بواقع 75,600 ريال شهرياً كطرف مدين على الحساب.</w:t>
-        <w:br/>
-        <w:t>• عكس وإلغاء 3 دفعات مسجلة سابقاً لعقد ملغى ومسوى (Ret-2018212: تمت التسوية) بقيمة 66,071 ريال لكل دفعة (إجمالي 198,213 ريال).</w:t>
-        <w:br/>
-        <w:t>• تسويات وتطبيع سندات القبض القديمة (PBASE و AR11213) وإعادة ربطها بالفواتير الفعلية.</w:t>
-      </w:r>
-    </w:p>
-    <w:p>
-      <w:pPr>
-        <w:spacing w:after="80" w:line="276" w:lineRule="auto"/>
+        <w:spacing w:after="60" w:line="276" w:lineRule="auto"/>
         <w:jc w:val="right"/>
         <w:bidi w:val="1"/>
       </w:pPr>
@@ -691,36 +499,28 @@
           <w:rFonts w:ascii="Amiri" w:hAnsi="Amiri" w:cs="Amiri" w:eastAsia="Amiri"/>
           <w:b/>
           <w:color w:val="294B62"/>
-          <w:sz w:val="22"/>
+          <w:sz w:val="21"/>
         </w:rPr>
-        <w:t>3. التكييف القانوني والمحاسبي المعتمد:</w:t>
+        <w:t xml:space="preserve">3. العلة المحاسبية لظهور الرصيد ومنع تكرار القيد: </w:t>
       </w:r>
       <w:r>
         <w:rPr>
           <w:rFonts w:ascii="Amiri" w:hAnsi="Amiri" w:cs="Amiri" w:eastAsia="Amiri"/>
           <w:b w:val="0"/>
-          <w:sz w:val="22"/>
+          <w:color w:val="173247"/>
+          <w:sz w:val="21"/>
         </w:rPr>
+        <w:t>قيود سداد الأقساط الـ 163 قُيدت بالطرف الدائن للبنك التجاري (11151) بموجب الشيكات والخصومات المباشرة، في حين أن الإيرادات النقدية المحصلة بالصندوق استُخدمت فعلياً في تغطية مسحوبات الأقساط وسداد إيجار المقر الشهري (2,900 ريال شهرياً) والمصاريف التشغيلية. وعليه، نؤكد لأمين التفليسة والمحكمة منع إعادة قيد هذه الأقساط على الصندوق مرة ثانية منعاً للازدواجية المحاسبية وتضخيم المصروفات؛ حيث تمت التسوية رسمياً في الإيضاح رقم (5) المتمم للقوائم المالية المعتمدة.</w:t>
+      </w:r>
+    </w:p>
+    <w:p>
+      <w:r>
+        <w:br w:type="page"/>
       </w:r>
     </w:p>
     <w:p>
       <w:pPr>
-        <w:spacing w:after="80" w:line="276" w:lineRule="auto"/>
-        <w:jc w:val="right"/>
-        <w:bidi w:val="1"/>
-      </w:pPr>
-      <w:r>
-        <w:rPr>
-          <w:rFonts w:ascii="Amiri" w:hAnsi="Amiri" w:cs="Amiri" w:eastAsia="Amiri"/>
-          <w:b w:val="0"/>
-          <w:sz w:val="22"/>
-        </w:rPr>
-        <w:t>صُنف الحساب تحت بند 'تأمينات ودفعات العملاء (Customer Deposits)' ضمن الالتزامات المتداولة؛ حيث تعتبر هذه المبالغ أمانات ودفعات تحت التسوية مخصومة من التزامات المنتهي بالتملك، مما حمى القوائم من تكرار تسجيل الإيراد وحقق توازناً تاماً للميزانية العمومية بفارق صفري (0.00 ريال) بدون أي خلل محاسبي.</w:t>
-      </w:r>
-    </w:p>
-    <w:p>
-      <w:pPr>
-        <w:spacing w:after="120" w:line="276" w:lineRule="auto" w:before="240"/>
+        <w:spacing w:after="80" w:line="276" w:lineRule="auto" w:before="160"/>
         <w:jc w:val="right"/>
         <w:keepNext/>
         <w:bidi w:val="1"/>
@@ -730,22 +530,116 @@
           <w:rFonts w:ascii="Amiri" w:hAnsi="Amiri" w:cs="Amiri" w:eastAsia="Amiri"/>
           <w:b/>
           <w:color w:val="294B62"/>
-          <w:sz w:val="30"/>
+          <w:sz w:val="27"/>
+        </w:rPr>
+        <w:t>ثالثاً: فحص وتكييف فروقات الحساب 11211 (عقود المنتهي بالتملك والتسويات)</w:t>
+      </w:r>
+    </w:p>
+    <w:p>
+      <w:pPr>
+        <w:spacing w:after="60" w:line="276" w:lineRule="auto"/>
+        <w:jc w:val="right"/>
+        <w:bidi w:val="1"/>
+      </w:pPr>
+      <w:r>
+        <w:rPr>
+          <w:rFonts w:ascii="Amiri" w:hAnsi="Amiri" w:cs="Amiri" w:eastAsia="Amiri"/>
+          <w:b/>
+          <w:color w:val="294B62"/>
+          <w:sz w:val="21"/>
+        </w:rPr>
+        <w:t xml:space="preserve">1. حركة الحساب بين الفترات: </w:t>
+      </w:r>
+      <w:r>
+        <w:rPr>
+          <w:rFonts w:ascii="Amiri" w:hAnsi="Amiri" w:cs="Amiri" w:eastAsia="Amiri"/>
+          <w:b w:val="0"/>
+          <w:color w:val="173247"/>
+          <w:sz w:val="21"/>
+        </w:rPr>
+        <w:t>بلغ رصيد الحساب في 31/12/2025 دائناً بمبلغ 1,008,862.49 ريال قطري، وتحول في 30/09/2026 إلى رصيد مدين قدره 272,277.70 ريال قطري (صافي حركة مدينة خلال 2026 بلغت 1,281,140.19 ريال قطري).</w:t>
+      </w:r>
+    </w:p>
+    <w:p>
+      <w:pPr>
+        <w:spacing w:after="60" w:line="276" w:lineRule="auto"/>
+        <w:jc w:val="right"/>
+        <w:bidi w:val="1"/>
+      </w:pPr>
+      <w:r>
+        <w:rPr>
+          <w:rFonts w:ascii="Amiri" w:hAnsi="Amiri" w:cs="Amiri" w:eastAsia="Amiri"/>
+          <w:b/>
+          <w:color w:val="294B62"/>
+          <w:sz w:val="21"/>
+        </w:rPr>
+        <w:t xml:space="preserve">2. تفكيك أسباب الحركة الدفترية: </w:t>
+      </w:r>
+      <w:r>
+        <w:rPr>
+          <w:rFonts w:ascii="Amiri" w:hAnsi="Amiri" w:cs="Amiri" w:eastAsia="Amiri"/>
+          <w:b w:val="0"/>
+          <w:color w:val="173247"/>
+          <w:sz w:val="21"/>
+        </w:rPr>
+        <w:t>قيد فواتير استحقاق عقد التأجير التمويلي LTO2024100 بواقع 75,600 ريال شهرياً، وعكس 3 دفعات مسجلة سابقاً لعقد ملغى ومسوى (Ret-2018212) بقيمة 66,071 ريال لكل دفعة (إجمالي 198,213 ريال)، إضافة إلى تطبيع سندات القبض القديمة وإعادة ربطها بالفواتير الفعلية.</w:t>
+      </w:r>
+    </w:p>
+    <w:p>
+      <w:pPr>
+        <w:spacing w:after="60" w:line="276" w:lineRule="auto"/>
+        <w:jc w:val="right"/>
+        <w:bidi w:val="1"/>
+      </w:pPr>
+      <w:r>
+        <w:rPr>
+          <w:rFonts w:ascii="Amiri" w:hAnsi="Amiri" w:cs="Amiri" w:eastAsia="Amiri"/>
+          <w:b/>
+          <w:color w:val="294B62"/>
+          <w:sz w:val="21"/>
+        </w:rPr>
+        <w:t xml:space="preserve">3. التكييف القانوني والمحاسبي المعتمد: </w:t>
+      </w:r>
+      <w:r>
+        <w:rPr>
+          <w:rFonts w:ascii="Amiri" w:hAnsi="Amiri" w:cs="Amiri" w:eastAsia="Amiri"/>
+          <w:b w:val="0"/>
+          <w:color w:val="173247"/>
+          <w:sz w:val="21"/>
+        </w:rPr>
+        <w:t>صُنف الحساب تحت بند 'تأمينات ودفعات العملاء' ضمن الالتزامات المتداولة، مما حمى القوائم من تكرار تسجيل الإيراد وحقق توازناً تاماً للميزانية العمومية بفارق صفري (0.00 ريال) بدون أي خلل محاسبي.</w:t>
+      </w:r>
+    </w:p>
+    <w:p>
+      <w:pPr>
+        <w:spacing w:after="80" w:line="276" w:lineRule="auto" w:before="160"/>
+        <w:jc w:val="right"/>
+        <w:keepNext/>
+        <w:bidi w:val="1"/>
+      </w:pPr>
+      <w:r>
+        <w:rPr>
+          <w:rFonts w:ascii="Amiri" w:hAnsi="Amiri" w:cs="Amiri" w:eastAsia="Amiri"/>
+          <w:b/>
+          <w:color w:val="294B62"/>
+          <w:sz w:val="27"/>
         </w:rPr>
         <w:t>رابعاً: حصر أسطول المركبات (221 مركبة) ومجمع الإهلاك والتقييم لغرض التصفية</w:t>
       </w:r>
     </w:p>
     <w:p>
       <w:pPr>
-        <w:spacing w:after="80" w:line="276" w:lineRule="auto"/>
+        <w:spacing w:after="60" w:line="276" w:lineRule="auto"/>
         <w:jc w:val="right"/>
+        <w:keepNext/>
         <w:bidi w:val="1"/>
       </w:pPr>
       <w:r>
         <w:rPr>
           <w:rFonts w:ascii="Amiri" w:hAnsi="Amiri" w:cs="Amiri" w:eastAsia="Amiri"/>
           <w:b w:val="0"/>
-          <w:sz w:val="22"/>
+          <w:color w:val="173247"/>
+          <w:sz w:val="21"/>
         </w:rPr>
         <w:t>استكملت المنشأة كافة بيانات الشراء لجميع مركبات الأسطول الـ 221 مركبة بناءً على فواتير مجموعة المانع وعقود التوريد وتاريخ أول قسط تشغيلي، وحُسب مجمع الإهلاك بالقسط الثابت:</w:t>
       </w:r>
@@ -756,28 +650,40 @@
         <w:jc w:val="center"/>
         <w:tblLook w:firstColumn="1" w:firstRow="1" w:lastColumn="0" w:lastRow="0" w:noHBand="0" w:noVBand="1" w:val="04A0"/>
         <w:bidiVisual/>
+        <w:tblBorders>
+          <w:top w:val="single" w:sz="4" w:space="0" w:color="D7E1E8"/>
+          <w:bottom w:val="single" w:sz="6" w:space="0" w:color="294B62"/>
+          <w:left w:val="none"/>
+          <w:right w:val="none"/>
+          <w:insideH w:val="single" w:sz="4" w:space="0" w:color="D7E1E8"/>
+          <w:insideV w:val="none"/>
+        </w:tblBorders>
       </w:tblPr>
       <w:tblGrid>
-        <w:gridCol w:w="3324"/>
-        <w:gridCol w:w="3324"/>
-        <w:gridCol w:w="3324"/>
+        <w:gridCol w:w="3400"/>
+        <w:gridCol w:w="3400"/>
+        <w:gridCol w:w="3400"/>
       </w:tblGrid>
       <w:tr>
+        <w:trPr>
+          <w:cantSplit/>
+          <w:tblHeader/>
+        </w:trPr>
         <w:tc>
           <w:tcPr>
-            <w:tcW w:type="dxa" w:w="3324"/>
+            <w:tcW w:type="dxa" w:w="3400"/>
             <w:shd w:fill="294B62"/>
             <w:tcMar>
-              <w:top w:w="100" w:type="dxa"/>
-              <w:bottom w:w="100" w:type="dxa"/>
-              <w:left w:w="140" w:type="dxa"/>
-              <w:right w:w="140" w:type="dxa"/>
+              <w:top w:w="40" w:type="dxa"/>
+              <w:bottom w:w="40" w:type="dxa"/>
+              <w:left w:w="80" w:type="dxa"/>
+              <w:right w:w="80" w:type="dxa"/>
             </w:tcMar>
             <w:vAlign w:val="center"/>
           </w:tcPr>
           <w:p>
             <w:pPr>
-              <w:spacing w:after="40" w:line="276" w:lineRule="auto"/>
+              <w:spacing w:after="20" w:line="276" w:lineRule="auto"/>
               <w:jc w:val="right"/>
               <w:bidi w:val="1"/>
             </w:pPr>
@@ -786,7 +692,7 @@
                 <w:rFonts w:ascii="Amiri" w:hAnsi="Amiri" w:cs="Amiri" w:eastAsia="Amiri"/>
                 <w:b/>
                 <w:color w:val="FFFFFF"/>
-                <w:sz w:val="20"/>
+                <w:sz w:val="19"/>
               </w:rPr>
               <w:t>البيان المالي للأسطول</w:t>
             </w:r>
@@ -794,19 +700,19 @@
         </w:tc>
         <w:tc>
           <w:tcPr>
-            <w:tcW w:type="dxa" w:w="3324"/>
+            <w:tcW w:type="dxa" w:w="3400"/>
             <w:shd w:fill="294B62"/>
             <w:tcMar>
-              <w:top w:w="100" w:type="dxa"/>
-              <w:bottom w:w="100" w:type="dxa"/>
-              <w:left w:w="140" w:type="dxa"/>
-              <w:right w:w="140" w:type="dxa"/>
+              <w:top w:w="40" w:type="dxa"/>
+              <w:bottom w:w="40" w:type="dxa"/>
+              <w:left w:w="80" w:type="dxa"/>
+              <w:right w:w="80" w:type="dxa"/>
             </w:tcMar>
             <w:vAlign w:val="center"/>
           </w:tcPr>
           <w:p>
             <w:pPr>
-              <w:spacing w:after="40" w:line="276" w:lineRule="auto"/>
+              <w:spacing w:after="20" w:line="276" w:lineRule="auto"/>
               <w:jc w:val="center"/>
               <w:bidi w:val="1"/>
             </w:pPr>
@@ -815,7 +721,7 @@
                 <w:rFonts w:ascii="Amiri" w:hAnsi="Amiri" w:cs="Amiri" w:eastAsia="Amiri"/>
                 <w:b/>
                 <w:color w:val="FFFFFF"/>
-                <w:sz w:val="20"/>
+                <w:sz w:val="19"/>
               </w:rPr>
               <w:t>القيمة الإجمالية (ر.ق)</w:t>
             </w:r>
@@ -823,19 +729,19 @@
         </w:tc>
         <w:tc>
           <w:tcPr>
-            <w:tcW w:type="dxa" w:w="3324"/>
+            <w:tcW w:type="dxa" w:w="3400"/>
             <w:shd w:fill="294B62"/>
             <w:tcMar>
-              <w:top w:w="100" w:type="dxa"/>
-              <w:bottom w:w="100" w:type="dxa"/>
-              <w:left w:w="140" w:type="dxa"/>
-              <w:right w:w="140" w:type="dxa"/>
+              <w:top w:w="40" w:type="dxa"/>
+              <w:bottom w:w="40" w:type="dxa"/>
+              <w:left w:w="80" w:type="dxa"/>
+              <w:right w:w="80" w:type="dxa"/>
             </w:tcMar>
             <w:vAlign w:val="center"/>
           </w:tcPr>
           <w:p>
             <w:pPr>
-              <w:spacing w:after="40" w:line="276" w:lineRule="auto"/>
+              <w:spacing w:after="20" w:line="276" w:lineRule="auto"/>
               <w:jc w:val="right"/>
               <w:bidi w:val="1"/>
             </w:pPr>
@@ -844,29 +750,32 @@
                 <w:rFonts w:ascii="Amiri" w:hAnsi="Amiri" w:cs="Amiri" w:eastAsia="Amiri"/>
                 <w:b/>
                 <w:color w:val="FFFFFF"/>
-                <w:sz w:val="20"/>
+                <w:sz w:val="19"/>
               </w:rPr>
-              <w:t>الملاحظات المحاسبية والتصفية</w:t>
+              <w:t>الملاحظات المحاسبية والتصفية القضائية</w:t>
             </w:r>
           </w:p>
         </w:tc>
       </w:tr>
       <w:tr>
+        <w:trPr>
+          <w:cantSplit/>
+        </w:trPr>
         <w:tc>
           <w:tcPr>
-            <w:tcW w:type="dxa" w:w="3324"/>
+            <w:tcW w:type="dxa" w:w="3400"/>
             <w:shd w:fill="F1F5F7"/>
             <w:tcMar>
-              <w:top w:w="100" w:type="dxa"/>
-              <w:bottom w:w="100" w:type="dxa"/>
-              <w:left w:w="140" w:type="dxa"/>
-              <w:right w:w="140" w:type="dxa"/>
+              <w:top w:w="40" w:type="dxa"/>
+              <w:bottom w:w="40" w:type="dxa"/>
+              <w:left w:w="80" w:type="dxa"/>
+              <w:right w:w="80" w:type="dxa"/>
             </w:tcMar>
             <w:vAlign w:val="center"/>
           </w:tcPr>
           <w:p>
             <w:pPr>
-              <w:spacing w:after="40" w:line="276" w:lineRule="auto"/>
+              <w:spacing w:after="20" w:line="276" w:lineRule="auto"/>
               <w:jc w:val="right"/>
               <w:bidi w:val="1"/>
             </w:pPr>
@@ -874,7 +783,8 @@
               <w:rPr>
                 <w:rFonts w:ascii="Amiri" w:hAnsi="Amiri" w:cs="Amiri" w:eastAsia="Amiri"/>
                 <w:b/>
-                <w:sz w:val="20"/>
+                <w:color w:val="173247"/>
+                <w:sz w:val="19"/>
               </w:rPr>
               <w:t>التكلفة التاريخية لشراء الأسطول</w:t>
             </w:r>
@@ -882,19 +792,19 @@
         </w:tc>
         <w:tc>
           <w:tcPr>
-            <w:tcW w:type="dxa" w:w="3324"/>
+            <w:tcW w:type="dxa" w:w="3400"/>
             <w:shd w:fill="F1F5F7"/>
             <w:tcMar>
-              <w:top w:w="100" w:type="dxa"/>
-              <w:bottom w:w="100" w:type="dxa"/>
-              <w:left w:w="140" w:type="dxa"/>
-              <w:right w:w="140" w:type="dxa"/>
+              <w:top w:w="40" w:type="dxa"/>
+              <w:bottom w:w="40" w:type="dxa"/>
+              <w:left w:w="80" w:type="dxa"/>
+              <w:right w:w="80" w:type="dxa"/>
             </w:tcMar>
             <w:vAlign w:val="center"/>
           </w:tcPr>
           <w:p>
             <w:pPr>
-              <w:spacing w:after="40" w:line="276" w:lineRule="auto"/>
+              <w:spacing w:after="20" w:line="276" w:lineRule="auto"/>
               <w:jc w:val="center"/>
               <w:bidi w:val="1"/>
             </w:pPr>
@@ -902,7 +812,8 @@
               <w:rPr>
                 <w:rFonts w:ascii="Amiri" w:hAnsi="Amiri" w:cs="Amiri" w:eastAsia="Amiri"/>
                 <w:b w:val="0"/>
-                <w:sz w:val="20"/>
+                <w:color w:val="173247"/>
+                <w:sz w:val="19"/>
               </w:rPr>
               <w:t>12,649,223.53</w:t>
             </w:r>
@@ -910,19 +821,19 @@
         </w:tc>
         <w:tc>
           <w:tcPr>
-            <w:tcW w:type="dxa" w:w="3324"/>
+            <w:tcW w:type="dxa" w:w="3400"/>
             <w:shd w:fill="F1F5F7"/>
             <w:tcMar>
-              <w:top w:w="100" w:type="dxa"/>
-              <w:bottom w:w="100" w:type="dxa"/>
-              <w:left w:w="140" w:type="dxa"/>
-              <w:right w:w="140" w:type="dxa"/>
+              <w:top w:w="40" w:type="dxa"/>
+              <w:bottom w:w="40" w:type="dxa"/>
+              <w:left w:w="80" w:type="dxa"/>
+              <w:right w:w="80" w:type="dxa"/>
             </w:tcMar>
             <w:vAlign w:val="center"/>
           </w:tcPr>
           <w:p>
             <w:pPr>
-              <w:spacing w:after="40" w:line="276" w:lineRule="auto"/>
+              <w:spacing w:after="20" w:line="276" w:lineRule="auto"/>
               <w:jc w:val="right"/>
               <w:bidi w:val="1"/>
             </w:pPr>
@@ -930,7 +841,8 @@
               <w:rPr>
                 <w:rFonts w:ascii="Amiri" w:hAnsi="Amiri" w:cs="Amiri" w:eastAsia="Amiri"/>
                 <w:b w:val="0"/>
-                <w:sz w:val="20"/>
+                <w:color w:val="173247"/>
+                <w:sz w:val="19"/>
               </w:rPr>
               <w:t>221 مركبة مثبتة بفواتير المانع والموردين بنسبة 100%</w:t>
             </w:r>
@@ -938,20 +850,23 @@
         </w:tc>
       </w:tr>
       <w:tr>
+        <w:trPr>
+          <w:cantSplit/>
+        </w:trPr>
         <w:tc>
           <w:tcPr>
-            <w:tcW w:type="dxa" w:w="3324"/>
+            <w:tcW w:type="dxa" w:w="3400"/>
             <w:tcMar>
-              <w:top w:w="100" w:type="dxa"/>
-              <w:bottom w:w="100" w:type="dxa"/>
-              <w:left w:w="140" w:type="dxa"/>
-              <w:right w:w="140" w:type="dxa"/>
+              <w:top w:w="40" w:type="dxa"/>
+              <w:bottom w:w="40" w:type="dxa"/>
+              <w:left w:w="80" w:type="dxa"/>
+              <w:right w:w="80" w:type="dxa"/>
             </w:tcMar>
             <w:vAlign w:val="center"/>
           </w:tcPr>
           <w:p>
             <w:pPr>
-              <w:spacing w:after="40" w:line="276" w:lineRule="auto"/>
+              <w:spacing w:after="20" w:line="276" w:lineRule="auto"/>
               <w:jc w:val="right"/>
               <w:bidi w:val="1"/>
             </w:pPr>
@@ -959,7 +874,8 @@
               <w:rPr>
                 <w:rFonts w:ascii="Amiri" w:hAnsi="Amiri" w:cs="Amiri" w:eastAsia="Amiri"/>
                 <w:b/>
-                <w:sz w:val="20"/>
+                <w:color w:val="173247"/>
+                <w:sz w:val="19"/>
               </w:rPr>
               <w:t>مجمع الإهلاك حتى 30/09/2026</w:t>
             </w:r>
@@ -967,18 +883,18 @@
         </w:tc>
         <w:tc>
           <w:tcPr>
-            <w:tcW w:type="dxa" w:w="3324"/>
+            <w:tcW w:type="dxa" w:w="3400"/>
             <w:tcMar>
-              <w:top w:w="100" w:type="dxa"/>
-              <w:bottom w:w="100" w:type="dxa"/>
-              <w:left w:w="140" w:type="dxa"/>
-              <w:right w:w="140" w:type="dxa"/>
+              <w:top w:w="40" w:type="dxa"/>
+              <w:bottom w:w="40" w:type="dxa"/>
+              <w:left w:w="80" w:type="dxa"/>
+              <w:right w:w="80" w:type="dxa"/>
             </w:tcMar>
             <w:vAlign w:val="center"/>
           </w:tcPr>
           <w:p>
             <w:pPr>
-              <w:spacing w:after="40" w:line="276" w:lineRule="auto"/>
+              <w:spacing w:after="20" w:line="276" w:lineRule="auto"/>
               <w:jc w:val="center"/>
               <w:bidi w:val="1"/>
             </w:pPr>
@@ -986,7 +902,8 @@
               <w:rPr>
                 <w:rFonts w:ascii="Amiri" w:hAnsi="Amiri" w:cs="Amiri" w:eastAsia="Amiri"/>
                 <w:b w:val="0"/>
-                <w:sz w:val="20"/>
+                <w:color w:val="173247"/>
+                <w:sz w:val="19"/>
               </w:rPr>
               <w:t>2,971,597.38</w:t>
             </w:r>
@@ -994,18 +911,18 @@
         </w:tc>
         <w:tc>
           <w:tcPr>
-            <w:tcW w:type="dxa" w:w="3324"/>
+            <w:tcW w:type="dxa" w:w="3400"/>
             <w:tcMar>
-              <w:top w:w="100" w:type="dxa"/>
-              <w:bottom w:w="100" w:type="dxa"/>
-              <w:left w:w="140" w:type="dxa"/>
-              <w:right w:w="140" w:type="dxa"/>
+              <w:top w:w="40" w:type="dxa"/>
+              <w:bottom w:w="40" w:type="dxa"/>
+              <w:left w:w="80" w:type="dxa"/>
+              <w:right w:w="80" w:type="dxa"/>
             </w:tcMar>
             <w:vAlign w:val="center"/>
           </w:tcPr>
           <w:p>
             <w:pPr>
-              <w:spacing w:after="40" w:line="276" w:lineRule="auto"/>
+              <w:spacing w:after="20" w:line="276" w:lineRule="auto"/>
               <w:jc w:val="right"/>
               <w:bidi w:val="1"/>
             </w:pPr>
@@ -1013,7 +930,8 @@
               <w:rPr>
                 <w:rFonts w:ascii="Amiri" w:hAnsi="Amiri" w:cs="Amiri" w:eastAsia="Amiri"/>
                 <w:b w:val="0"/>
-                <w:sz w:val="20"/>
+                <w:color w:val="173247"/>
+                <w:sz w:val="19"/>
               </w:rPr>
               <w:t>محسوب بطريقة القسط الثابت من تاريخ بدء التشغيل الفعلي</w:t>
             </w:r>
@@ -1021,21 +939,24 @@
         </w:tc>
       </w:tr>
       <w:tr>
+        <w:trPr>
+          <w:cantSplit/>
+        </w:trPr>
         <w:tc>
           <w:tcPr>
-            <w:tcW w:type="dxa" w:w="3324"/>
+            <w:tcW w:type="dxa" w:w="3400"/>
             <w:shd w:fill="F1F5F7"/>
             <w:tcMar>
-              <w:top w:w="100" w:type="dxa"/>
-              <w:bottom w:w="100" w:type="dxa"/>
-              <w:left w:w="140" w:type="dxa"/>
-              <w:right w:w="140" w:type="dxa"/>
+              <w:top w:w="40" w:type="dxa"/>
+              <w:bottom w:w="40" w:type="dxa"/>
+              <w:left w:w="80" w:type="dxa"/>
+              <w:right w:w="80" w:type="dxa"/>
             </w:tcMar>
             <w:vAlign w:val="center"/>
           </w:tcPr>
           <w:p>
             <w:pPr>
-              <w:spacing w:after="40" w:line="276" w:lineRule="auto"/>
+              <w:spacing w:after="20" w:line="276" w:lineRule="auto"/>
               <w:jc w:val="right"/>
               <w:bidi w:val="1"/>
             </w:pPr>
@@ -1043,7 +964,8 @@
               <w:rPr>
                 <w:rFonts w:ascii="Amiri" w:hAnsi="Amiri" w:cs="Amiri" w:eastAsia="Amiri"/>
                 <w:b/>
-                <w:sz w:val="20"/>
+                <w:color w:val="173247"/>
+                <w:sz w:val="19"/>
               </w:rPr>
               <w:t>صافي القيمة الدفترية التقديرية الحالية</w:t>
             </w:r>
@@ -1051,19 +973,19 @@
         </w:tc>
         <w:tc>
           <w:tcPr>
-            <w:tcW w:type="dxa" w:w="3324"/>
+            <w:tcW w:type="dxa" w:w="3400"/>
             <w:shd w:fill="F1F5F7"/>
             <w:tcMar>
-              <w:top w:w="100" w:type="dxa"/>
-              <w:bottom w:w="100" w:type="dxa"/>
-              <w:left w:w="140" w:type="dxa"/>
-              <w:right w:w="140" w:type="dxa"/>
+              <w:top w:w="40" w:type="dxa"/>
+              <w:bottom w:w="40" w:type="dxa"/>
+              <w:left w:w="80" w:type="dxa"/>
+              <w:right w:w="80" w:type="dxa"/>
             </w:tcMar>
             <w:vAlign w:val="center"/>
           </w:tcPr>
           <w:p>
             <w:pPr>
-              <w:spacing w:after="40" w:line="276" w:lineRule="auto"/>
+              <w:spacing w:after="20" w:line="276" w:lineRule="auto"/>
               <w:jc w:val="center"/>
               <w:bidi w:val="1"/>
             </w:pPr>
@@ -1071,7 +993,8 @@
               <w:rPr>
                 <w:rFonts w:ascii="Amiri" w:hAnsi="Amiri" w:cs="Amiri" w:eastAsia="Amiri"/>
                 <w:b w:val="0"/>
-                <w:sz w:val="20"/>
+                <w:color w:val="173247"/>
+                <w:sz w:val="19"/>
               </w:rPr>
               <w:t>9,677,626.15</w:t>
             </w:r>
@@ -1079,19 +1002,19 @@
         </w:tc>
         <w:tc>
           <w:tcPr>
-            <w:tcW w:type="dxa" w:w="3324"/>
+            <w:tcW w:type="dxa" w:w="3400"/>
             <w:shd w:fill="F1F5F7"/>
             <w:tcMar>
-              <w:top w:w="100" w:type="dxa"/>
-              <w:bottom w:w="100" w:type="dxa"/>
-              <w:left w:w="140" w:type="dxa"/>
-              <w:right w:w="140" w:type="dxa"/>
+              <w:top w:w="40" w:type="dxa"/>
+              <w:bottom w:w="40" w:type="dxa"/>
+              <w:left w:w="80" w:type="dxa"/>
+              <w:right w:w="80" w:type="dxa"/>
             </w:tcMar>
             <w:vAlign w:val="center"/>
           </w:tcPr>
           <w:p>
             <w:pPr>
-              <w:spacing w:after="40" w:line="276" w:lineRule="auto"/>
+              <w:spacing w:after="20" w:line="276" w:lineRule="auto"/>
               <w:jc w:val="right"/>
               <w:bidi w:val="1"/>
             </w:pPr>
@@ -1099,7 +1022,8 @@
               <w:rPr>
                 <w:rFonts w:ascii="Amiri" w:hAnsi="Amiri" w:cs="Amiri" w:eastAsia="Amiri"/>
                 <w:b w:val="0"/>
-                <w:sz w:val="20"/>
+                <w:color w:val="173247"/>
+                <w:sz w:val="19"/>
               </w:rPr>
               <w:t>الأساس المتاح لأمين التفليسة للتقييم والتسييل القضائي</w:t>
             </w:r>
@@ -1107,20 +1031,23 @@
         </w:tc>
       </w:tr>
       <w:tr>
+        <w:trPr>
+          <w:cantSplit/>
+        </w:trPr>
         <w:tc>
           <w:tcPr>
-            <w:tcW w:type="dxa" w:w="3324"/>
+            <w:tcW w:type="dxa" w:w="3400"/>
             <w:tcMar>
-              <w:top w:w="100" w:type="dxa"/>
-              <w:bottom w:w="100" w:type="dxa"/>
-              <w:left w:w="140" w:type="dxa"/>
-              <w:right w:w="140" w:type="dxa"/>
+              <w:top w:w="40" w:type="dxa"/>
+              <w:bottom w:w="40" w:type="dxa"/>
+              <w:left w:w="80" w:type="dxa"/>
+              <w:right w:w="80" w:type="dxa"/>
             </w:tcMar>
             <w:vAlign w:val="center"/>
           </w:tcPr>
           <w:p>
             <w:pPr>
-              <w:spacing w:after="40" w:line="276" w:lineRule="auto"/>
+              <w:spacing w:after="20" w:line="276" w:lineRule="auto"/>
               <w:jc w:val="right"/>
               <w:bidi w:val="1"/>
             </w:pPr>
@@ -1128,7 +1055,8 @@
               <w:rPr>
                 <w:rFonts w:ascii="Amiri" w:hAnsi="Amiri" w:cs="Amiri" w:eastAsia="Amiri"/>
                 <w:b/>
-                <w:sz w:val="20"/>
+                <w:color w:val="173247"/>
+                <w:sz w:val="19"/>
               </w:rPr>
               <w:t>القيمة المثبتة دفترياً بالميزانية المعتمدة</w:t>
             </w:r>
@@ -1136,18 +1064,18 @@
         </w:tc>
         <w:tc>
           <w:tcPr>
-            <w:tcW w:type="dxa" w:w="3324"/>
+            <w:tcW w:type="dxa" w:w="3400"/>
             <w:tcMar>
-              <w:top w:w="100" w:type="dxa"/>
-              <w:bottom w:w="100" w:type="dxa"/>
-              <w:left w:w="140" w:type="dxa"/>
-              <w:right w:w="140" w:type="dxa"/>
+              <w:top w:w="40" w:type="dxa"/>
+              <w:bottom w:w="40" w:type="dxa"/>
+              <w:left w:w="80" w:type="dxa"/>
+              <w:right w:w="80" w:type="dxa"/>
             </w:tcMar>
             <w:vAlign w:val="center"/>
           </w:tcPr>
           <w:p>
             <w:pPr>
-              <w:spacing w:after="40" w:line="276" w:lineRule="auto"/>
+              <w:spacing w:after="20" w:line="276" w:lineRule="auto"/>
               <w:jc w:val="center"/>
               <w:bidi w:val="1"/>
             </w:pPr>
@@ -1155,7 +1083,8 @@
               <w:rPr>
                 <w:rFonts w:ascii="Amiri" w:hAnsi="Amiri" w:cs="Amiri" w:eastAsia="Amiri"/>
                 <w:b w:val="0"/>
-                <w:sz w:val="20"/>
+                <w:color w:val="173247"/>
+                <w:sz w:val="19"/>
               </w:rPr>
               <w:t>2,538,802.00</w:t>
             </w:r>
@@ -1163,18 +1092,18 @@
         </w:tc>
         <w:tc>
           <w:tcPr>
-            <w:tcW w:type="dxa" w:w="3324"/>
+            <w:tcW w:type="dxa" w:w="3400"/>
             <w:tcMar>
-              <w:top w:w="100" w:type="dxa"/>
-              <w:bottom w:w="100" w:type="dxa"/>
-              <w:left w:w="140" w:type="dxa"/>
-              <w:right w:w="140" w:type="dxa"/>
+              <w:top w:w="40" w:type="dxa"/>
+              <w:bottom w:w="40" w:type="dxa"/>
+              <w:left w:w="80" w:type="dxa"/>
+              <w:right w:w="80" w:type="dxa"/>
             </w:tcMar>
             <w:vAlign w:val="center"/>
           </w:tcPr>
           <w:p>
             <w:pPr>
-              <w:spacing w:after="40" w:line="276" w:lineRule="auto"/>
+              <w:spacing w:after="20" w:line="276" w:lineRule="auto"/>
               <w:jc w:val="right"/>
               <w:bidi w:val="1"/>
             </w:pPr>
@@ -1182,9 +1111,10 @@
               <w:rPr>
                 <w:rFonts w:ascii="Amiri" w:hAnsi="Amiri" w:cs="Amiri" w:eastAsia="Amiri"/>
                 <w:b w:val="0"/>
-                <w:sz w:val="20"/>
+                <w:color w:val="173247"/>
+                <w:sz w:val="19"/>
               </w:rPr>
-              <w:t>صافي المركبات المقيدة دفترياً بعد استبعاد أصول التمويل والحوادث</w:t>
+              <w:t>صافي أصول السيارات الدفترية بعد استبعاد أصول التمويل والحوادث</w:t>
             </w:r>
           </w:p>
         </w:tc>
@@ -1192,7 +1122,7 @@
     </w:tbl>
     <w:p>
       <w:pPr>
-        <w:spacing w:after="120" w:line="276" w:lineRule="auto"/>
+        <w:spacing w:after="40" w:line="276" w:lineRule="auto"/>
         <w:jc w:val="right"/>
         <w:bidi w:val="1"/>
       </w:pPr>
@@ -1200,28 +1130,20 @@
         <w:rPr>
           <w:rFonts w:ascii="Amiri" w:hAnsi="Amiri" w:cs="Amiri" w:eastAsia="Amiri"/>
           <w:b w:val="0"/>
-          <w:sz w:val="22"/>
-        </w:rPr>
-      </w:r>
-    </w:p>
-    <w:p>
-      <w:pPr>
-        <w:spacing w:after="80" w:line="276" w:lineRule="auto"/>
-        <w:jc w:val="right"/>
-        <w:bidi w:val="1"/>
-      </w:pPr>
-      <w:r>
-        <w:rPr>
-          <w:rFonts w:ascii="Amiri" w:hAnsi="Amiri" w:cs="Amiri" w:eastAsia="Amiri"/>
-          <w:b w:val="0"/>
-          <w:sz w:val="22"/>
+          <w:color w:val="173247"/>
+          <w:sz w:val="21"/>
         </w:rPr>
         <w:t>• التوزيع الميداني للمركبات: 94 مركبة جاهزة للتسييل الفوري بحوزة الشركة، 59 مركبة مؤجرة سارية العقود، 29 مركبة محتجزة بمواقف شارع 52، 14 مركبة بحجز البلدية، 11 سكراب خارج الخدمة، 6 عهدة موظفين، 4 شطب حوادث، 2 ورش صيانة، 2 مسروقة بموجب بلاغات شرطة رسمية مرفقة بالكشف التفصيلي.</w:t>
       </w:r>
     </w:p>
     <w:p>
+      <w:r>
+        <w:br w:type="page"/>
+      </w:r>
+    </w:p>
+    <w:p>
       <w:pPr>
-        <w:spacing w:after="120" w:line="276" w:lineRule="auto" w:before="240"/>
+        <w:spacing w:after="80" w:line="276" w:lineRule="auto" w:before="160"/>
         <w:jc w:val="right"/>
         <w:keepNext/>
         <w:bidi w:val="1"/>
@@ -1231,7 +1153,7 @@
           <w:rFonts w:ascii="Amiri" w:hAnsi="Amiri" w:cs="Amiri" w:eastAsia="Amiri"/>
           <w:b/>
           <w:color w:val="294B62"/>
-          <w:sz w:val="30"/>
+          <w:sz w:val="27"/>
         </w:rPr>
         <w:t>خامساً: جدول الدائنين وتمويلات المركبات القائمة</w:t>
       </w:r>
@@ -1242,29 +1164,41 @@
         <w:jc w:val="center"/>
         <w:tblLook w:firstColumn="1" w:firstRow="1" w:lastColumn="0" w:lastRow="0" w:noHBand="0" w:noVBand="1" w:val="04A0"/>
         <w:bidiVisual/>
+        <w:tblBorders>
+          <w:top w:val="single" w:sz="4" w:space="0" w:color="D7E1E8"/>
+          <w:bottom w:val="single" w:sz="6" w:space="0" w:color="294B62"/>
+          <w:left w:val="none"/>
+          <w:right w:val="none"/>
+          <w:insideH w:val="single" w:sz="4" w:space="0" w:color="D7E1E8"/>
+          <w:insideV w:val="none"/>
+        </w:tblBorders>
       </w:tblPr>
       <w:tblGrid>
-        <w:gridCol w:w="2493"/>
-        <w:gridCol w:w="2493"/>
-        <w:gridCol w:w="2493"/>
-        <w:gridCol w:w="2493"/>
+        <w:gridCol w:w="2550"/>
+        <w:gridCol w:w="2550"/>
+        <w:gridCol w:w="2550"/>
+        <w:gridCol w:w="2550"/>
       </w:tblGrid>
       <w:tr>
+        <w:trPr>
+          <w:cantSplit/>
+          <w:tblHeader/>
+        </w:trPr>
         <w:tc>
           <w:tcPr>
-            <w:tcW w:type="dxa" w:w="2493"/>
+            <w:tcW w:type="dxa" w:w="2550"/>
             <w:shd w:fill="294B62"/>
             <w:tcMar>
-              <w:top w:w="100" w:type="dxa"/>
-              <w:bottom w:w="100" w:type="dxa"/>
-              <w:left w:w="140" w:type="dxa"/>
-              <w:right w:w="140" w:type="dxa"/>
+              <w:top w:w="40" w:type="dxa"/>
+              <w:bottom w:w="40" w:type="dxa"/>
+              <w:left w:w="80" w:type="dxa"/>
+              <w:right w:w="80" w:type="dxa"/>
             </w:tcMar>
             <w:vAlign w:val="center"/>
           </w:tcPr>
           <w:p>
             <w:pPr>
-              <w:spacing w:after="40" w:line="276" w:lineRule="auto"/>
+              <w:spacing w:after="20" w:line="276" w:lineRule="auto"/>
               <w:jc w:val="right"/>
               <w:bidi w:val="1"/>
             </w:pPr>
@@ -1281,19 +1215,19 @@
         </w:tc>
         <w:tc>
           <w:tcPr>
-            <w:tcW w:type="dxa" w:w="2493"/>
+            <w:tcW w:type="dxa" w:w="2550"/>
             <w:shd w:fill="294B62"/>
             <w:tcMar>
-              <w:top w:w="100" w:type="dxa"/>
-              <w:bottom w:w="100" w:type="dxa"/>
-              <w:left w:w="140" w:type="dxa"/>
-              <w:right w:w="140" w:type="dxa"/>
+              <w:top w:w="40" w:type="dxa"/>
+              <w:bottom w:w="40" w:type="dxa"/>
+              <w:left w:w="80" w:type="dxa"/>
+              <w:right w:w="80" w:type="dxa"/>
             </w:tcMar>
             <w:vAlign w:val="center"/>
           </w:tcPr>
           <w:p>
             <w:pPr>
-              <w:spacing w:after="40" w:line="276" w:lineRule="auto"/>
+              <w:spacing w:after="20" w:line="276" w:lineRule="auto"/>
               <w:jc w:val="right"/>
               <w:bidi w:val="1"/>
             </w:pPr>
@@ -1310,19 +1244,19 @@
         </w:tc>
         <w:tc>
           <w:tcPr>
-            <w:tcW w:type="dxa" w:w="2493"/>
+            <w:tcW w:type="dxa" w:w="2550"/>
             <w:shd w:fill="294B62"/>
             <w:tcMar>
-              <w:top w:w="100" w:type="dxa"/>
-              <w:bottom w:w="100" w:type="dxa"/>
-              <w:left w:w="140" w:type="dxa"/>
-              <w:right w:w="140" w:type="dxa"/>
+              <w:top w:w="40" w:type="dxa"/>
+              <w:bottom w:w="40" w:type="dxa"/>
+              <w:left w:w="80" w:type="dxa"/>
+              <w:right w:w="80" w:type="dxa"/>
             </w:tcMar>
             <w:vAlign w:val="center"/>
           </w:tcPr>
           <w:p>
             <w:pPr>
-              <w:spacing w:after="40" w:line="276" w:lineRule="auto"/>
+              <w:spacing w:after="20" w:line="276" w:lineRule="auto"/>
               <w:jc w:val="center"/>
               <w:bidi w:val="1"/>
             </w:pPr>
@@ -1339,19 +1273,19 @@
         </w:tc>
         <w:tc>
           <w:tcPr>
-            <w:tcW w:type="dxa" w:w="2493"/>
+            <w:tcW w:type="dxa" w:w="2550"/>
             <w:shd w:fill="294B62"/>
             <w:tcMar>
-              <w:top w:w="100" w:type="dxa"/>
-              <w:bottom w:w="100" w:type="dxa"/>
-              <w:left w:w="140" w:type="dxa"/>
-              <w:right w:w="140" w:type="dxa"/>
+              <w:top w:w="40" w:type="dxa"/>
+              <w:bottom w:w="40" w:type="dxa"/>
+              <w:left w:w="80" w:type="dxa"/>
+              <w:right w:w="80" w:type="dxa"/>
             </w:tcMar>
             <w:vAlign w:val="center"/>
           </w:tcPr>
           <w:p>
             <w:pPr>
-              <w:spacing w:after="40" w:line="276" w:lineRule="auto"/>
+              <w:spacing w:after="20" w:line="276" w:lineRule="auto"/>
               <w:jc w:val="center"/>
               <w:bidi w:val="1"/>
             </w:pPr>
@@ -1368,21 +1302,24 @@
         </w:tc>
       </w:tr>
       <w:tr>
+        <w:trPr>
+          <w:cantSplit/>
+        </w:trPr>
         <w:tc>
           <w:tcPr>
-            <w:tcW w:type="dxa" w:w="2493"/>
+            <w:tcW w:type="dxa" w:w="2550"/>
             <w:shd w:fill="F1F5F7"/>
             <w:tcMar>
-              <w:top w:w="100" w:type="dxa"/>
-              <w:bottom w:w="100" w:type="dxa"/>
-              <w:left w:w="140" w:type="dxa"/>
-              <w:right w:w="140" w:type="dxa"/>
+              <w:top w:w="40" w:type="dxa"/>
+              <w:bottom w:w="40" w:type="dxa"/>
+              <w:left w:w="80" w:type="dxa"/>
+              <w:right w:w="80" w:type="dxa"/>
             </w:tcMar>
             <w:vAlign w:val="center"/>
           </w:tcPr>
           <w:p>
             <w:pPr>
-              <w:spacing w:after="40" w:line="276" w:lineRule="auto"/>
+              <w:spacing w:after="20" w:line="276" w:lineRule="auto"/>
               <w:jc w:val="right"/>
               <w:bidi w:val="1"/>
             </w:pPr>
@@ -1390,6 +1327,7 @@
               <w:rPr>
                 <w:rFonts w:ascii="Amiri" w:hAnsi="Amiri" w:cs="Amiri" w:eastAsia="Amiri"/>
                 <w:b w:val="0"/>
+                <w:color w:val="173247"/>
                 <w:sz w:val="19"/>
               </w:rPr>
               <w:t>مجموعة المانع (Pioneer Motors)</w:t>
@@ -1398,19 +1336,19 @@
         </w:tc>
         <w:tc>
           <w:tcPr>
-            <w:tcW w:type="dxa" w:w="2493"/>
+            <w:tcW w:type="dxa" w:w="2550"/>
             <w:shd w:fill="F1F5F7"/>
             <w:tcMar>
-              <w:top w:w="100" w:type="dxa"/>
-              <w:bottom w:w="100" w:type="dxa"/>
-              <w:left w:w="140" w:type="dxa"/>
-              <w:right w:w="140" w:type="dxa"/>
+              <w:top w:w="40" w:type="dxa"/>
+              <w:bottom w:w="40" w:type="dxa"/>
+              <w:left w:w="80" w:type="dxa"/>
+              <w:right w:w="80" w:type="dxa"/>
             </w:tcMar>
             <w:vAlign w:val="center"/>
           </w:tcPr>
           <w:p>
             <w:pPr>
-              <w:spacing w:after="40" w:line="276" w:lineRule="auto"/>
+              <w:spacing w:after="20" w:line="276" w:lineRule="auto"/>
               <w:jc w:val="right"/>
               <w:bidi w:val="1"/>
             </w:pPr>
@@ -1418,6 +1356,7 @@
               <w:rPr>
                 <w:rFonts w:ascii="Amiri" w:hAnsi="Amiri" w:cs="Amiri" w:eastAsia="Amiri"/>
                 <w:b w:val="0"/>
+                <w:color w:val="173247"/>
                 <w:sz w:val="19"/>
               </w:rPr>
               <w:t>عقد BESTUNE — 126 مركبة</w:t>
@@ -1426,19 +1365,19 @@
         </w:tc>
         <w:tc>
           <w:tcPr>
-            <w:tcW w:type="dxa" w:w="2493"/>
+            <w:tcW w:type="dxa" w:w="2550"/>
             <w:shd w:fill="F1F5F7"/>
             <w:tcMar>
-              <w:top w:w="100" w:type="dxa"/>
-              <w:bottom w:w="100" w:type="dxa"/>
-              <w:left w:w="140" w:type="dxa"/>
-              <w:right w:w="140" w:type="dxa"/>
+              <w:top w:w="40" w:type="dxa"/>
+              <w:bottom w:w="40" w:type="dxa"/>
+              <w:left w:w="80" w:type="dxa"/>
+              <w:right w:w="80" w:type="dxa"/>
             </w:tcMar>
             <w:vAlign w:val="center"/>
           </w:tcPr>
           <w:p>
             <w:pPr>
-              <w:spacing w:after="40" w:line="276" w:lineRule="auto"/>
+              <w:spacing w:after="20" w:line="276" w:lineRule="auto"/>
               <w:jc w:val="center"/>
               <w:bidi w:val="1"/>
             </w:pPr>
@@ -1446,6 +1385,7 @@
               <w:rPr>
                 <w:rFonts w:ascii="Amiri" w:hAnsi="Amiri" w:cs="Amiri" w:eastAsia="Amiri"/>
                 <w:b w:val="0"/>
+                <w:color w:val="173247"/>
                 <w:sz w:val="19"/>
               </w:rPr>
               <w:t>6,118,346.00</w:t>
@@ -1454,19 +1394,19 @@
         </w:tc>
         <w:tc>
           <w:tcPr>
-            <w:tcW w:type="dxa" w:w="2493"/>
+            <w:tcW w:type="dxa" w:w="2550"/>
             <w:shd w:fill="F1F5F7"/>
             <w:tcMar>
-              <w:top w:w="100" w:type="dxa"/>
-              <w:bottom w:w="100" w:type="dxa"/>
-              <w:left w:w="140" w:type="dxa"/>
-              <w:right w:w="140" w:type="dxa"/>
+              <w:top w:w="40" w:type="dxa"/>
+              <w:bottom w:w="40" w:type="dxa"/>
+              <w:left w:w="80" w:type="dxa"/>
+              <w:right w:w="80" w:type="dxa"/>
             </w:tcMar>
             <w:vAlign w:val="center"/>
           </w:tcPr>
           <w:p>
             <w:pPr>
-              <w:spacing w:after="40" w:line="276" w:lineRule="auto"/>
+              <w:spacing w:after="20" w:line="276" w:lineRule="auto"/>
               <w:jc w:val="center"/>
               <w:bidi w:val="1"/>
             </w:pPr>
@@ -1474,6 +1414,7 @@
               <w:rPr>
                 <w:rFonts w:ascii="Amiri" w:hAnsi="Amiri" w:cs="Amiri" w:eastAsia="Amiri"/>
                 <w:b w:val="0"/>
+                <w:color w:val="173247"/>
                 <w:sz w:val="19"/>
               </w:rPr>
               <w:t>6,118,346.10</w:t>
@@ -1482,20 +1423,23 @@
         </w:tc>
       </w:tr>
       <w:tr>
+        <w:trPr>
+          <w:cantSplit/>
+        </w:trPr>
         <w:tc>
           <w:tcPr>
-            <w:tcW w:type="dxa" w:w="2493"/>
+            <w:tcW w:type="dxa" w:w="2550"/>
             <w:tcMar>
-              <w:top w:w="100" w:type="dxa"/>
-              <w:bottom w:w="100" w:type="dxa"/>
-              <w:left w:w="140" w:type="dxa"/>
-              <w:right w:w="140" w:type="dxa"/>
+              <w:top w:w="40" w:type="dxa"/>
+              <w:bottom w:w="40" w:type="dxa"/>
+              <w:left w:w="80" w:type="dxa"/>
+              <w:right w:w="80" w:type="dxa"/>
             </w:tcMar>
             <w:vAlign w:val="center"/>
           </w:tcPr>
           <w:p>
             <w:pPr>
-              <w:spacing w:after="40" w:line="276" w:lineRule="auto"/>
+              <w:spacing w:after="20" w:line="276" w:lineRule="auto"/>
               <w:jc w:val="right"/>
               <w:bidi w:val="1"/>
             </w:pPr>
@@ -1503,6 +1447,7 @@
               <w:rPr>
                 <w:rFonts w:ascii="Amiri" w:hAnsi="Amiri" w:cs="Amiri" w:eastAsia="Amiri"/>
                 <w:b w:val="0"/>
+                <w:color w:val="173247"/>
                 <w:sz w:val="19"/>
               </w:rPr>
               <w:t>شركة إيلاف أوتو (CHANGAN)</w:t>
@@ -1511,18 +1456,18 @@
         </w:tc>
         <w:tc>
           <w:tcPr>
-            <w:tcW w:type="dxa" w:w="2493"/>
+            <w:tcW w:type="dxa" w:w="2550"/>
             <w:tcMar>
-              <w:top w:w="100" w:type="dxa"/>
-              <w:bottom w:w="100" w:type="dxa"/>
-              <w:left w:w="140" w:type="dxa"/>
-              <w:right w:w="140" w:type="dxa"/>
+              <w:top w:w="40" w:type="dxa"/>
+              <w:bottom w:w="40" w:type="dxa"/>
+              <w:left w:w="80" w:type="dxa"/>
+              <w:right w:w="80" w:type="dxa"/>
             </w:tcMar>
             <w:vAlign w:val="center"/>
           </w:tcPr>
           <w:p>
             <w:pPr>
-              <w:spacing w:after="40" w:line="276" w:lineRule="auto"/>
+              <w:spacing w:after="20" w:line="276" w:lineRule="auto"/>
               <w:jc w:val="right"/>
               <w:bidi w:val="1"/>
             </w:pPr>
@@ -1530,6 +1475,7 @@
               <w:rPr>
                 <w:rFonts w:ascii="Amiri" w:hAnsi="Amiri" w:cs="Amiri" w:eastAsia="Amiri"/>
                 <w:b w:val="0"/>
+                <w:color w:val="173247"/>
                 <w:sz w:val="19"/>
               </w:rPr>
               <w:t>عقد شانجان — 20 مركبة</w:t>
@@ -1538,18 +1484,18 @@
         </w:tc>
         <w:tc>
           <w:tcPr>
-            <w:tcW w:type="dxa" w:w="2493"/>
+            <w:tcW w:type="dxa" w:w="2550"/>
             <w:tcMar>
-              <w:top w:w="100" w:type="dxa"/>
-              <w:bottom w:w="100" w:type="dxa"/>
-              <w:left w:w="140" w:type="dxa"/>
-              <w:right w:w="140" w:type="dxa"/>
+              <w:top w:w="40" w:type="dxa"/>
+              <w:bottom w:w="40" w:type="dxa"/>
+              <w:left w:w="80" w:type="dxa"/>
+              <w:right w:w="80" w:type="dxa"/>
             </w:tcMar>
             <w:vAlign w:val="center"/>
           </w:tcPr>
           <w:p>
             <w:pPr>
-              <w:spacing w:after="40" w:line="276" w:lineRule="auto"/>
+              <w:spacing w:after="20" w:line="276" w:lineRule="auto"/>
               <w:jc w:val="center"/>
               <w:bidi w:val="1"/>
             </w:pPr>
@@ -1557,6 +1503,7 @@
               <w:rPr>
                 <w:rFonts w:ascii="Amiri" w:hAnsi="Amiri" w:cs="Amiri" w:eastAsia="Amiri"/>
                 <w:b w:val="0"/>
+                <w:color w:val="173247"/>
                 <w:sz w:val="19"/>
               </w:rPr>
               <w:t>832,510.00</w:t>
@@ -1565,18 +1512,18 @@
         </w:tc>
         <w:tc>
           <w:tcPr>
-            <w:tcW w:type="dxa" w:w="2493"/>
+            <w:tcW w:type="dxa" w:w="2550"/>
             <w:tcMar>
-              <w:top w:w="100" w:type="dxa"/>
-              <w:bottom w:w="100" w:type="dxa"/>
-              <w:left w:w="140" w:type="dxa"/>
-              <w:right w:w="140" w:type="dxa"/>
+              <w:top w:w="40" w:type="dxa"/>
+              <w:bottom w:w="40" w:type="dxa"/>
+              <w:left w:w="80" w:type="dxa"/>
+              <w:right w:w="80" w:type="dxa"/>
             </w:tcMar>
             <w:vAlign w:val="center"/>
           </w:tcPr>
           <w:p>
             <w:pPr>
-              <w:spacing w:after="40" w:line="276" w:lineRule="auto"/>
+              <w:spacing w:after="20" w:line="276" w:lineRule="auto"/>
               <w:jc w:val="center"/>
               <w:bidi w:val="1"/>
             </w:pPr>
@@ -1584,6 +1531,7 @@
               <w:rPr>
                 <w:rFonts w:ascii="Amiri" w:hAnsi="Amiri" w:cs="Amiri" w:eastAsia="Amiri"/>
                 <w:b w:val="0"/>
+                <w:color w:val="173247"/>
                 <w:sz w:val="19"/>
               </w:rPr>
               <w:t>80,568.00</w:t>
@@ -1592,21 +1540,24 @@
         </w:tc>
       </w:tr>
       <w:tr>
+        <w:trPr>
+          <w:cantSplit/>
+        </w:trPr>
         <w:tc>
           <w:tcPr>
-            <w:tcW w:type="dxa" w:w="2493"/>
+            <w:tcW w:type="dxa" w:w="2550"/>
             <w:shd w:fill="F1F5F7"/>
             <w:tcMar>
-              <w:top w:w="100" w:type="dxa"/>
-              <w:bottom w:w="100" w:type="dxa"/>
-              <w:left w:w="140" w:type="dxa"/>
-              <w:right w:w="140" w:type="dxa"/>
+              <w:top w:w="40" w:type="dxa"/>
+              <w:bottom w:w="40" w:type="dxa"/>
+              <w:left w:w="80" w:type="dxa"/>
+              <w:right w:w="80" w:type="dxa"/>
             </w:tcMar>
             <w:vAlign w:val="center"/>
           </w:tcPr>
           <w:p>
             <w:pPr>
-              <w:spacing w:after="40" w:line="276" w:lineRule="auto"/>
+              <w:spacing w:after="20" w:line="276" w:lineRule="auto"/>
               <w:jc w:val="right"/>
               <w:bidi w:val="1"/>
             </w:pPr>
@@ -1614,6 +1565,7 @@
               <w:rPr>
                 <w:rFonts w:ascii="Amiri" w:hAnsi="Amiri" w:cs="Amiri" w:eastAsia="Amiri"/>
                 <w:b w:val="0"/>
+                <w:color w:val="173247"/>
                 <w:sz w:val="19"/>
               </w:rPr>
               <w:t>شركة الأولى للتمويل</w:t>
@@ -1622,19 +1574,19 @@
         </w:tc>
         <w:tc>
           <w:tcPr>
-            <w:tcW w:type="dxa" w:w="2493"/>
+            <w:tcW w:type="dxa" w:w="2550"/>
             <w:shd w:fill="F1F5F7"/>
             <w:tcMar>
-              <w:top w:w="100" w:type="dxa"/>
-              <w:bottom w:w="100" w:type="dxa"/>
-              <w:left w:w="140" w:type="dxa"/>
-              <w:right w:w="140" w:type="dxa"/>
+              <w:top w:w="40" w:type="dxa"/>
+              <w:bottom w:w="40" w:type="dxa"/>
+              <w:left w:w="80" w:type="dxa"/>
+              <w:right w:w="80" w:type="dxa"/>
             </w:tcMar>
             <w:vAlign w:val="center"/>
           </w:tcPr>
           <w:p>
             <w:pPr>
-              <w:spacing w:after="40" w:line="276" w:lineRule="auto"/>
+              <w:spacing w:after="20" w:line="276" w:lineRule="auto"/>
               <w:jc w:val="right"/>
               <w:bidi w:val="1"/>
             </w:pPr>
@@ -1642,6 +1594,7 @@
               <w:rPr>
                 <w:rFonts w:ascii="Amiri" w:hAnsi="Amiri" w:cs="Amiri" w:eastAsia="Amiri"/>
                 <w:b w:val="0"/>
+                <w:color w:val="173247"/>
                 <w:sz w:val="19"/>
               </w:rPr>
               <w:t>عقد MG — 25 مركبة</w:t>
@@ -1650,19 +1603,19 @@
         </w:tc>
         <w:tc>
           <w:tcPr>
-            <w:tcW w:type="dxa" w:w="2493"/>
+            <w:tcW w:type="dxa" w:w="2550"/>
             <w:shd w:fill="F1F5F7"/>
             <w:tcMar>
-              <w:top w:w="100" w:type="dxa"/>
-              <w:bottom w:w="100" w:type="dxa"/>
-              <w:left w:w="140" w:type="dxa"/>
-              <w:right w:w="140" w:type="dxa"/>
+              <w:top w:w="40" w:type="dxa"/>
+              <w:bottom w:w="40" w:type="dxa"/>
+              <w:left w:w="80" w:type="dxa"/>
+              <w:right w:w="80" w:type="dxa"/>
             </w:tcMar>
             <w:vAlign w:val="center"/>
           </w:tcPr>
           <w:p>
             <w:pPr>
-              <w:spacing w:after="40" w:line="276" w:lineRule="auto"/>
+              <w:spacing w:after="20" w:line="276" w:lineRule="auto"/>
               <w:jc w:val="center"/>
               <w:bidi w:val="1"/>
             </w:pPr>
@@ -1670,6 +1623,7 @@
               <w:rPr>
                 <w:rFonts w:ascii="Amiri" w:hAnsi="Amiri" w:cs="Amiri" w:eastAsia="Amiri"/>
                 <w:b w:val="0"/>
+                <w:color w:val="173247"/>
                 <w:sz w:val="19"/>
               </w:rPr>
               <w:t>1,378,924.00</w:t>
@@ -1678,19 +1632,19 @@
         </w:tc>
         <w:tc>
           <w:tcPr>
-            <w:tcW w:type="dxa" w:w="2493"/>
+            <w:tcW w:type="dxa" w:w="2550"/>
             <w:shd w:fill="F1F5F7"/>
             <w:tcMar>
-              <w:top w:w="100" w:type="dxa"/>
-              <w:bottom w:w="100" w:type="dxa"/>
-              <w:left w:w="140" w:type="dxa"/>
-              <w:right w:w="140" w:type="dxa"/>
+              <w:top w:w="40" w:type="dxa"/>
+              <w:bottom w:w="40" w:type="dxa"/>
+              <w:left w:w="80" w:type="dxa"/>
+              <w:right w:w="80" w:type="dxa"/>
             </w:tcMar>
             <w:vAlign w:val="center"/>
           </w:tcPr>
           <w:p>
             <w:pPr>
-              <w:spacing w:after="40" w:line="276" w:lineRule="auto"/>
+              <w:spacing w:after="20" w:line="276" w:lineRule="auto"/>
               <w:jc w:val="center"/>
               <w:bidi w:val="1"/>
             </w:pPr>
@@ -1698,6 +1652,7 @@
               <w:rPr>
                 <w:rFonts w:ascii="Amiri" w:hAnsi="Amiri" w:cs="Amiri" w:eastAsia="Amiri"/>
                 <w:b w:val="0"/>
+                <w:color w:val="173247"/>
                 <w:sz w:val="19"/>
               </w:rPr>
               <w:t>0.00 (مسدد بالكامل)</w:t>
@@ -1706,20 +1661,23 @@
         </w:tc>
       </w:tr>
       <w:tr>
+        <w:trPr>
+          <w:cantSplit/>
+        </w:trPr>
         <w:tc>
           <w:tcPr>
-            <w:tcW w:type="dxa" w:w="2493"/>
+            <w:tcW w:type="dxa" w:w="2550"/>
             <w:tcMar>
-              <w:top w:w="100" w:type="dxa"/>
-              <w:bottom w:w="100" w:type="dxa"/>
-              <w:left w:w="140" w:type="dxa"/>
-              <w:right w:w="140" w:type="dxa"/>
+              <w:top w:w="40" w:type="dxa"/>
+              <w:bottom w:w="40" w:type="dxa"/>
+              <w:left w:w="80" w:type="dxa"/>
+              <w:right w:w="80" w:type="dxa"/>
             </w:tcMar>
             <w:vAlign w:val="center"/>
           </w:tcPr>
           <w:p>
             <w:pPr>
-              <w:spacing w:after="40" w:line="276" w:lineRule="auto"/>
+              <w:spacing w:after="20" w:line="276" w:lineRule="auto"/>
               <w:jc w:val="right"/>
               <w:bidi w:val="1"/>
             </w:pPr>
@@ -1727,6 +1685,7 @@
               <w:rPr>
                 <w:rFonts w:ascii="Amiri" w:hAnsi="Amiri" w:cs="Amiri" w:eastAsia="Amiri"/>
                 <w:b w:val="0"/>
+                <w:color w:val="173247"/>
                 <w:sz w:val="19"/>
               </w:rPr>
               <w:t>البنك التجاري (GAC مرحلة 1 و 2)</w:t>
@@ -1735,18 +1694,18 @@
         </w:tc>
         <w:tc>
           <w:tcPr>
-            <w:tcW w:type="dxa" w:w="2493"/>
+            <w:tcW w:type="dxa" w:w="2550"/>
             <w:tcMar>
-              <w:top w:w="100" w:type="dxa"/>
-              <w:bottom w:w="100" w:type="dxa"/>
-              <w:left w:w="140" w:type="dxa"/>
-              <w:right w:w="140" w:type="dxa"/>
+              <w:top w:w="40" w:type="dxa"/>
+              <w:bottom w:w="40" w:type="dxa"/>
+              <w:left w:w="80" w:type="dxa"/>
+              <w:right w:w="80" w:type="dxa"/>
             </w:tcMar>
             <w:vAlign w:val="center"/>
           </w:tcPr>
           <w:p>
             <w:pPr>
-              <w:spacing w:after="40" w:line="276" w:lineRule="auto"/>
+              <w:spacing w:after="20" w:line="276" w:lineRule="auto"/>
               <w:jc w:val="right"/>
               <w:bidi w:val="1"/>
             </w:pPr>
@@ -1754,6 +1713,7 @@
               <w:rPr>
                 <w:rFonts w:ascii="Amiri" w:hAnsi="Amiri" w:cs="Amiri" w:eastAsia="Amiri"/>
                 <w:b w:val="0"/>
+                <w:color w:val="173247"/>
                 <w:sz w:val="19"/>
               </w:rPr>
               <w:t>عقد GAC — 17 مركبة</w:t>
@@ -1762,18 +1722,18 @@
         </w:tc>
         <w:tc>
           <w:tcPr>
-            <w:tcW w:type="dxa" w:w="2493"/>
+            <w:tcW w:type="dxa" w:w="2550"/>
             <w:tcMar>
-              <w:top w:w="100" w:type="dxa"/>
-              <w:bottom w:w="100" w:type="dxa"/>
-              <w:left w:w="140" w:type="dxa"/>
-              <w:right w:w="140" w:type="dxa"/>
+              <w:top w:w="40" w:type="dxa"/>
+              <w:bottom w:w="40" w:type="dxa"/>
+              <w:left w:w="80" w:type="dxa"/>
+              <w:right w:w="80" w:type="dxa"/>
             </w:tcMar>
             <w:vAlign w:val="center"/>
           </w:tcPr>
           <w:p>
             <w:pPr>
-              <w:spacing w:after="40" w:line="276" w:lineRule="auto"/>
+              <w:spacing w:after="20" w:line="276" w:lineRule="auto"/>
               <w:jc w:val="center"/>
               <w:bidi w:val="1"/>
             </w:pPr>
@@ -1781,6 +1741,7 @@
               <w:rPr>
                 <w:rFonts w:ascii="Amiri" w:hAnsi="Amiri" w:cs="Amiri" w:eastAsia="Amiri"/>
                 <w:b w:val="0"/>
+                <w:color w:val="173247"/>
                 <w:sz w:val="19"/>
               </w:rPr>
               <w:t>872,200.00</w:t>
@@ -1789,18 +1750,18 @@
         </w:tc>
         <w:tc>
           <w:tcPr>
-            <w:tcW w:type="dxa" w:w="2493"/>
+            <w:tcW w:type="dxa" w:w="2550"/>
             <w:tcMar>
-              <w:top w:w="100" w:type="dxa"/>
-              <w:bottom w:w="100" w:type="dxa"/>
-              <w:left w:w="140" w:type="dxa"/>
-              <w:right w:w="140" w:type="dxa"/>
+              <w:top w:w="40" w:type="dxa"/>
+              <w:bottom w:w="40" w:type="dxa"/>
+              <w:left w:w="80" w:type="dxa"/>
+              <w:right w:w="80" w:type="dxa"/>
             </w:tcMar>
             <w:vAlign w:val="center"/>
           </w:tcPr>
           <w:p>
             <w:pPr>
-              <w:spacing w:after="40" w:line="276" w:lineRule="auto"/>
+              <w:spacing w:after="20" w:line="276" w:lineRule="auto"/>
               <w:jc w:val="center"/>
               <w:bidi w:val="1"/>
             </w:pPr>
@@ -1808,6 +1769,7 @@
               <w:rPr>
                 <w:rFonts w:ascii="Amiri" w:hAnsi="Amiri" w:cs="Amiri" w:eastAsia="Amiri"/>
                 <w:b w:val="0"/>
+                <w:color w:val="173247"/>
                 <w:sz w:val="19"/>
               </w:rPr>
               <w:t>0.00 (مسدد بالكامل)</w:t>
@@ -1816,21 +1778,24 @@
         </w:tc>
       </w:tr>
       <w:tr>
+        <w:trPr>
+          <w:cantSplit/>
+        </w:trPr>
         <w:tc>
           <w:tcPr>
-            <w:tcW w:type="dxa" w:w="2493"/>
+            <w:tcW w:type="dxa" w:w="2550"/>
             <w:shd w:fill="F1F5F7"/>
             <w:tcMar>
-              <w:top w:w="100" w:type="dxa"/>
-              <w:bottom w:w="100" w:type="dxa"/>
-              <w:left w:w="140" w:type="dxa"/>
-              <w:right w:w="140" w:type="dxa"/>
+              <w:top w:w="40" w:type="dxa"/>
+              <w:bottom w:w="40" w:type="dxa"/>
+              <w:left w:w="80" w:type="dxa"/>
+              <w:right w:w="80" w:type="dxa"/>
             </w:tcMar>
             <w:vAlign w:val="center"/>
           </w:tcPr>
           <w:p>
             <w:pPr>
-              <w:spacing w:after="40" w:line="276" w:lineRule="auto"/>
+              <w:spacing w:after="20" w:line="276" w:lineRule="auto"/>
               <w:jc w:val="right"/>
               <w:bidi w:val="1"/>
             </w:pPr>
@@ -1838,6 +1803,7 @@
               <w:rPr>
                 <w:rFonts w:ascii="Amiri" w:hAnsi="Amiri" w:cs="Amiri" w:eastAsia="Amiri"/>
                 <w:b w:val="0"/>
+                <w:color w:val="173247"/>
                 <w:sz w:val="19"/>
               </w:rPr>
               <w:t>شركة آل طالب (DONGFENG)</w:t>
@@ -1846,19 +1812,19 @@
         </w:tc>
         <w:tc>
           <w:tcPr>
-            <w:tcW w:type="dxa" w:w="2493"/>
+            <w:tcW w:type="dxa" w:w="2550"/>
             <w:shd w:fill="F1F5F7"/>
             <w:tcMar>
-              <w:top w:w="100" w:type="dxa"/>
-              <w:bottom w:w="100" w:type="dxa"/>
-              <w:left w:w="140" w:type="dxa"/>
-              <w:right w:w="140" w:type="dxa"/>
+              <w:top w:w="40" w:type="dxa"/>
+              <w:bottom w:w="40" w:type="dxa"/>
+              <w:left w:w="80" w:type="dxa"/>
+              <w:right w:w="80" w:type="dxa"/>
             </w:tcMar>
             <w:vAlign w:val="center"/>
           </w:tcPr>
           <w:p>
             <w:pPr>
-              <w:spacing w:after="40" w:line="276" w:lineRule="auto"/>
+              <w:spacing w:after="20" w:line="276" w:lineRule="auto"/>
               <w:jc w:val="right"/>
               <w:bidi w:val="1"/>
             </w:pPr>
@@ -1866,6 +1832,7 @@
               <w:rPr>
                 <w:rFonts w:ascii="Amiri" w:hAnsi="Amiri" w:cs="Amiri" w:eastAsia="Amiri"/>
                 <w:b w:val="0"/>
+                <w:color w:val="173247"/>
                 <w:sz w:val="19"/>
               </w:rPr>
               <w:t>عقد دونغ فينغ — 5 مركبات</w:t>
@@ -1874,19 +1841,19 @@
         </w:tc>
         <w:tc>
           <w:tcPr>
-            <w:tcW w:type="dxa" w:w="2493"/>
+            <w:tcW w:type="dxa" w:w="2550"/>
             <w:shd w:fill="F1F5F7"/>
             <w:tcMar>
-              <w:top w:w="100" w:type="dxa"/>
-              <w:bottom w:w="100" w:type="dxa"/>
-              <w:left w:w="140" w:type="dxa"/>
-              <w:right w:w="140" w:type="dxa"/>
+              <w:top w:w="40" w:type="dxa"/>
+              <w:bottom w:w="40" w:type="dxa"/>
+              <w:left w:w="80" w:type="dxa"/>
+              <w:right w:w="80" w:type="dxa"/>
             </w:tcMar>
             <w:vAlign w:val="center"/>
           </w:tcPr>
           <w:p>
             <w:pPr>
-              <w:spacing w:after="40" w:line="276" w:lineRule="auto"/>
+              <w:spacing w:after="20" w:line="276" w:lineRule="auto"/>
               <w:jc w:val="center"/>
               <w:bidi w:val="1"/>
             </w:pPr>
@@ -1894,6 +1861,7 @@
               <w:rPr>
                 <w:rFonts w:ascii="Amiri" w:hAnsi="Amiri" w:cs="Amiri" w:eastAsia="Amiri"/>
                 <w:b w:val="0"/>
+                <w:color w:val="173247"/>
                 <w:sz w:val="19"/>
               </w:rPr>
               <w:t>391,140.00</w:t>
@@ -1902,19 +1870,19 @@
         </w:tc>
         <w:tc>
           <w:tcPr>
-            <w:tcW w:type="dxa" w:w="2493"/>
+            <w:tcW w:type="dxa" w:w="2550"/>
             <w:shd w:fill="F1F5F7"/>
             <w:tcMar>
-              <w:top w:w="100" w:type="dxa"/>
-              <w:bottom w:w="100" w:type="dxa"/>
-              <w:left w:w="140" w:type="dxa"/>
-              <w:right w:w="140" w:type="dxa"/>
+              <w:top w:w="40" w:type="dxa"/>
+              <w:bottom w:w="40" w:type="dxa"/>
+              <w:left w:w="80" w:type="dxa"/>
+              <w:right w:w="80" w:type="dxa"/>
             </w:tcMar>
             <w:vAlign w:val="center"/>
           </w:tcPr>
           <w:p>
             <w:pPr>
-              <w:spacing w:after="40" w:line="276" w:lineRule="auto"/>
+              <w:spacing w:after="20" w:line="276" w:lineRule="auto"/>
               <w:jc w:val="center"/>
               <w:bidi w:val="1"/>
             </w:pPr>
@@ -1922,6 +1890,7 @@
               <w:rPr>
                 <w:rFonts w:ascii="Amiri" w:hAnsi="Amiri" w:cs="Amiri" w:eastAsia="Amiri"/>
                 <w:b w:val="0"/>
+                <w:color w:val="173247"/>
                 <w:sz w:val="19"/>
               </w:rPr>
               <w:t>0.00 (مسدد بالكامل)</w:t>
@@ -1930,21 +1899,24 @@
         </w:tc>
       </w:tr>
       <w:tr>
+        <w:trPr>
+          <w:cantSplit/>
+        </w:trPr>
         <w:tc>
           <w:tcPr>
-            <w:tcW w:type="dxa" w:w="2493"/>
+            <w:tcW w:type="dxa" w:w="2550"/>
             <w:shd w:fill="E1ECF2"/>
             <w:tcMar>
-              <w:top w:w="100" w:type="dxa"/>
-              <w:bottom w:w="100" w:type="dxa"/>
-              <w:left w:w="140" w:type="dxa"/>
-              <w:right w:w="140" w:type="dxa"/>
+              <w:top w:w="40" w:type="dxa"/>
+              <w:bottom w:w="40" w:type="dxa"/>
+              <w:left w:w="80" w:type="dxa"/>
+              <w:right w:w="80" w:type="dxa"/>
             </w:tcMar>
             <w:vAlign w:val="center"/>
           </w:tcPr>
           <w:p>
             <w:pPr>
-              <w:spacing w:after="40" w:line="276" w:lineRule="auto"/>
+              <w:spacing w:after="20" w:line="276" w:lineRule="auto"/>
               <w:jc w:val="right"/>
               <w:bidi w:val="1"/>
             </w:pPr>
@@ -1952,6 +1924,7 @@
               <w:rPr>
                 <w:rFonts w:ascii="Amiri" w:hAnsi="Amiri" w:cs="Amiri" w:eastAsia="Amiri"/>
                 <w:b/>
+                <w:color w:val="173247"/>
                 <w:sz w:val="19"/>
               </w:rPr>
               <w:t>إجمالي ديون تمويل المركبات</w:t>
@@ -1960,19 +1933,19 @@
         </w:tc>
         <w:tc>
           <w:tcPr>
-            <w:tcW w:type="dxa" w:w="2493"/>
+            <w:tcW w:type="dxa" w:w="2550"/>
             <w:shd w:fill="E1ECF2"/>
             <w:tcMar>
-              <w:top w:w="100" w:type="dxa"/>
-              <w:bottom w:w="100" w:type="dxa"/>
-              <w:left w:w="140" w:type="dxa"/>
-              <w:right w:w="140" w:type="dxa"/>
+              <w:top w:w="40" w:type="dxa"/>
+              <w:bottom w:w="40" w:type="dxa"/>
+              <w:left w:w="80" w:type="dxa"/>
+              <w:right w:w="80" w:type="dxa"/>
             </w:tcMar>
             <w:vAlign w:val="center"/>
           </w:tcPr>
           <w:p>
             <w:pPr>
-              <w:spacing w:after="40" w:line="276" w:lineRule="auto"/>
+              <w:spacing w:after="20" w:line="276" w:lineRule="auto"/>
               <w:jc w:val="right"/>
               <w:bidi w:val="1"/>
             </w:pPr>
@@ -1980,6 +1953,7 @@
               <w:rPr>
                 <w:rFonts w:ascii="Amiri" w:hAnsi="Amiri" w:cs="Amiri" w:eastAsia="Amiri"/>
                 <w:b/>
+                <w:color w:val="173247"/>
                 <w:sz w:val="19"/>
               </w:rPr>
               <w:t>مطابق تماماً لبند القروض بالميزانية</w:t>
@@ -1988,19 +1962,19 @@
         </w:tc>
         <w:tc>
           <w:tcPr>
-            <w:tcW w:type="dxa" w:w="2493"/>
+            <w:tcW w:type="dxa" w:w="2550"/>
             <w:shd w:fill="E1ECF2"/>
             <w:tcMar>
-              <w:top w:w="100" w:type="dxa"/>
-              <w:bottom w:w="100" w:type="dxa"/>
-              <w:left w:w="140" w:type="dxa"/>
-              <w:right w:w="140" w:type="dxa"/>
+              <w:top w:w="40" w:type="dxa"/>
+              <w:bottom w:w="40" w:type="dxa"/>
+              <w:left w:w="80" w:type="dxa"/>
+              <w:right w:w="80" w:type="dxa"/>
             </w:tcMar>
             <w:vAlign w:val="center"/>
           </w:tcPr>
           <w:p>
             <w:pPr>
-              <w:spacing w:after="40" w:line="276" w:lineRule="auto"/>
+              <w:spacing w:after="20" w:line="276" w:lineRule="auto"/>
               <w:jc w:val="center"/>
               <w:bidi w:val="1"/>
             </w:pPr>
@@ -2008,6 +1982,7 @@
               <w:rPr>
                 <w:rFonts w:ascii="Amiri" w:hAnsi="Amiri" w:cs="Amiri" w:eastAsia="Amiri"/>
                 <w:b/>
+                <w:color w:val="173247"/>
                 <w:sz w:val="19"/>
               </w:rPr>
               <w:t>9,593,120.00</w:t>
@@ -2016,19 +1991,19 @@
         </w:tc>
         <w:tc>
           <w:tcPr>
-            <w:tcW w:type="dxa" w:w="2493"/>
+            <w:tcW w:type="dxa" w:w="2550"/>
             <w:shd w:fill="E1ECF2"/>
             <w:tcMar>
-              <w:top w:w="100" w:type="dxa"/>
-              <w:bottom w:w="100" w:type="dxa"/>
-              <w:left w:w="140" w:type="dxa"/>
-              <w:right w:w="140" w:type="dxa"/>
+              <w:top w:w="40" w:type="dxa"/>
+              <w:bottom w:w="40" w:type="dxa"/>
+              <w:left w:w="80" w:type="dxa"/>
+              <w:right w:w="80" w:type="dxa"/>
             </w:tcMar>
             <w:vAlign w:val="center"/>
           </w:tcPr>
           <w:p>
             <w:pPr>
-              <w:spacing w:after="40" w:line="276" w:lineRule="auto"/>
+              <w:spacing w:after="20" w:line="276" w:lineRule="auto"/>
               <w:jc w:val="center"/>
               <w:bidi w:val="1"/>
             </w:pPr>
@@ -2036,6 +2011,7 @@
               <w:rPr>
                 <w:rFonts w:ascii="Amiri" w:hAnsi="Amiri" w:cs="Amiri" w:eastAsia="Amiri"/>
                 <w:b/>
+                <w:color w:val="173247"/>
                 <w:sz w:val="19"/>
               </w:rPr>
               <w:t>6,198,914.10</w:t>
@@ -2046,7 +2022,7 @@
     </w:tbl>
     <w:p>
       <w:pPr>
-        <w:spacing w:after="120" w:line="276" w:lineRule="auto" w:before="240"/>
+        <w:spacing w:after="80" w:line="276" w:lineRule="auto" w:before="160"/>
         <w:jc w:val="right"/>
         <w:keepNext/>
         <w:bidi w:val="1"/>
@@ -2056,14 +2032,14 @@
           <w:rFonts w:ascii="Amiri" w:hAnsi="Amiri" w:cs="Amiri" w:eastAsia="Amiri"/>
           <w:b/>
           <w:color w:val="294B62"/>
-          <w:sz w:val="30"/>
+          <w:sz w:val="27"/>
         </w:rPr>
         <w:t>سادساً: الطلبات الختامية</w:t>
       </w:r>
     </w:p>
     <w:p>
       <w:pPr>
-        <w:spacing w:after="80" w:line="276" w:lineRule="auto"/>
+        <w:spacing w:after="60" w:line="276" w:lineRule="auto"/>
         <w:jc w:val="right"/>
         <w:bidi w:val="1"/>
       </w:pPr>
@@ -2071,14 +2047,15 @@
         <w:rPr>
           <w:rFonts w:ascii="Amiri" w:hAnsi="Amiri" w:cs="Amiri" w:eastAsia="Amiri"/>
           <w:b w:val="0"/>
-          <w:sz w:val="22"/>
+          <w:color w:val="173247"/>
+          <w:sz w:val="21"/>
         </w:rPr>
         <w:t>بناءً على ما تقدم وعلى القوائم المالية الرسمية المعتمدة المرفقة، نلتمس من السيد أمين التفليسة والمحكمة الموقرة:</w:t>
       </w:r>
     </w:p>
     <w:p>
       <w:pPr>
-        <w:spacing w:after="80" w:line="276" w:lineRule="auto"/>
+        <w:spacing w:after="60" w:line="276" w:lineRule="auto"/>
         <w:jc w:val="right"/>
         <w:bidi w:val="1"/>
       </w:pPr>
@@ -2086,14 +2063,15 @@
         <w:rPr>
           <w:rFonts w:ascii="Amiri" w:hAnsi="Amiri" w:cs="Amiri" w:eastAsia="Amiri"/>
           <w:b w:val="0"/>
-          <w:sz w:val="22"/>
+          <w:color w:val="173247"/>
+          <w:sz w:val="21"/>
         </w:rPr>
         <w:t>1. اعتماد القوائم المالية الرسمية المرفقة للسنوات من 2023 إلى 2026 بحالتها المعتمدة برقم الحزمة 4329bfef-ab4f-4b86-a1b8-6315f762e0e1.</w:t>
       </w:r>
     </w:p>
     <w:p>
       <w:pPr>
-        <w:spacing w:after="80" w:line="276" w:lineRule="auto"/>
+        <w:spacing w:after="60" w:line="276" w:lineRule="auto"/>
         <w:jc w:val="right"/>
         <w:bidi w:val="1"/>
       </w:pPr>
@@ -2101,14 +2079,15 @@
         <w:rPr>
           <w:rFonts w:ascii="Amiri" w:hAnsi="Amiri" w:cs="Amiri" w:eastAsia="Amiri"/>
           <w:b w:val="0"/>
-          <w:sz w:val="22"/>
+          <w:color w:val="173247"/>
+          <w:sz w:val="21"/>
         </w:rPr>
         <w:t>2. إثبات عدم تكرار تسجيل أقساط تمويل السيارات على الصندوق وفق الثابت بالإيضاح رقم (5).</w:t>
       </w:r>
     </w:p>
     <w:p>
       <w:pPr>
-        <w:spacing w:after="80" w:line="276" w:lineRule="auto"/>
+        <w:spacing w:after="60" w:line="276" w:lineRule="auto"/>
         <w:jc w:val="right"/>
         <w:bidi w:val="1"/>
       </w:pPr>
@@ -2116,7 +2095,8 @@
         <w:rPr>
           <w:rFonts w:ascii="Amiri" w:hAnsi="Amiri" w:cs="Amiri" w:eastAsia="Amiri"/>
           <w:b w:val="0"/>
-          <w:sz w:val="22"/>
+          <w:color w:val="173247"/>
+          <w:sz w:val="21"/>
         </w:rPr>
         <w:t>3. اعتماد كشف حصر وجرد أسطول المركبات (221 مركبة) ومباشرة إجراءات استلام وحفظ وتسييل الأصول لصالح هيئة الدائنين.</w:t>
       </w:r>
@@ -2131,13 +2111,14 @@
         <w:rPr>
           <w:rFonts w:ascii="Amiri" w:hAnsi="Amiri" w:cs="Amiri" w:eastAsia="Amiri"/>
           <w:b w:val="0"/>
-          <w:sz w:val="22"/>
+          <w:color w:val="173247"/>
+          <w:sz w:val="21"/>
         </w:rPr>
       </w:r>
     </w:p>
     <w:p>
       <w:pPr>
-        <w:spacing w:after="80" w:line="276" w:lineRule="auto"/>
+        <w:spacing w:after="60" w:line="276" w:lineRule="auto"/>
         <w:jc w:val="center"/>
         <w:bidi w:val="1"/>
       </w:pPr>
@@ -2145,6 +2126,7 @@
         <w:rPr>
           <w:rFonts w:ascii="Amiri" w:hAnsi="Amiri" w:cs="Amiri" w:eastAsia="Amiri"/>
           <w:b/>
+          <w:color w:val="173247"/>
           <w:sz w:val="22"/>
         </w:rPr>
         <w:t>وتفضلوا بقبول وافر الاحترام والتقدير،،،</w:t>
@@ -2152,7 +2134,7 @@
     </w:p>
     <w:p>
       <w:pPr>
-        <w:spacing w:after="80" w:line="276" w:lineRule="auto"/>
+        <w:spacing w:after="60" w:line="276" w:lineRule="auto"/>
         <w:jc w:val="left"/>
         <w:bidi w:val="1"/>
       </w:pPr>
@@ -2160,6 +2142,7 @@
         <w:rPr>
           <w:rFonts w:ascii="Amiri" w:hAnsi="Amiri" w:cs="Amiri" w:eastAsia="Amiri"/>
           <w:b/>
+          <w:color w:val="173247"/>
           <w:sz w:val="22"/>
         </w:rPr>
         <w:t>عن شركة العراف لتأجير السيارات ذ.م.م</w:t>
@@ -2169,7 +2152,7 @@
     </w:p>
     <w:sectPr>
       <w:pgSz w:w="12240" w:h="15840"/>
-      <w:pgMar w:top="1134" w:right="1134" w:bottom="1134" w:left="1134" w:header="720" w:footer="720" w:gutter="0"/>
+      <w:pgMar w:top="907" w:right="1020" w:bottom="907" w:left="1020" w:header="720" w:footer="720" w:gutter="0"/>
       <w:cols w:space="720"/>
       <w:docGrid w:linePitch="360"/>
     </w:sectPr>

</xml_diff>